<commit_message>
Dydaktyczne sprawy dodane do pliku Charakterystyka 2026.
</commit_message>
<xml_diff>
--- a/Charakterystyki/Charakterystyka_nauczycieli_2026.docx
+++ b/Charakterystyki/Charakterystyka_nauczycieli_2026.docx
@@ -1,35 +1,40 @@
 
 <file path=word/document.xml><?xml version="1.0" encoding="utf-8"?>
-<w:document xmlns:wpc="http://schemas.microsoft.com/office/word/2010/wordprocessingCanvas" xmlns:cx="http://schemas.microsoft.com/office/drawing/2014/chartex" xmlns:cx1="http://schemas.microsoft.com/office/drawing/2015/9/8/chartex" xmlns:cx2="http://schemas.microsoft.com/office/drawing/2015/10/21/chartex" xmlns:cx3="http://schemas.microsoft.com/office/drawing/2016/5/9/chartex" xmlns:cx4="http://schemas.microsoft.com/office/drawing/2016/5/10/chartex" xmlns:cx5="http://schemas.microsoft.com/office/drawing/2016/5/11/chartex" xmlns:cx6="http://schemas.microsoft.com/office/drawing/2016/5/12/chartex" xmlns:cx7="http://schemas.microsoft.com/office/drawing/2016/5/13/chartex" xmlns:cx8="http://schemas.microsoft.com/office/drawing/2016/5/14/chartex" xmlns:mc="http://schemas.openxmlformats.org/markup-compatibility/2006" xmlns:aink="http://schemas.microsoft.com/office/drawing/2016/ink" xmlns:am3d="http://schemas.microsoft.com/office/drawing/2017/model3d" xmlns:o="urn:schemas-microsoft-com:office:office" xmlns:oel="http://schemas.microsoft.com/office/2019/extlst" xmlns:r="http://schemas.openxmlformats.org/officeDocument/2006/relationships" xmlns:m="http://schemas.openxmlformats.org/officeDocument/2006/math" xmlns:v="urn:schemas-microsoft-com:vml" xmlns:wp14="http://schemas.microsoft.com/office/word/2010/wordprocessingDrawing" xmlns:wp="http://schemas.openxmlformats.org/drawingml/2006/wordprocessingDrawing" xmlns:w10="urn:schemas-microsoft-com:office:word" xmlns:w="http://schemas.openxmlformats.org/wordprocessingml/2006/main" xmlns:w14="http://schemas.microsoft.com/office/word/2010/wordml" xmlns:w15="http://schemas.microsoft.com/office/word/2012/wordml" xmlns:w16cex="http://schemas.microsoft.com/office/word/2018/wordml/cex" xmlns:w16cid="http://schemas.microsoft.com/office/word/2016/wordml/cid" xmlns:w16="http://schemas.microsoft.com/office/word/2018/wordml" xmlns:w16du="http://schemas.microsoft.com/office/word/2023/wordml/word16du" xmlns:w16sdtdh="http://schemas.microsoft.com/office/word/2020/wordml/sdtdatahash" xmlns:w16sdtfl="http://schemas.microsoft.com/office/word/2024/wordml/sdtformatlock" xmlns:w16se="http://schemas.microsoft.com/office/word/2015/wordml/symex" xmlns:wpg="http://schemas.microsoft.com/office/word/2010/wordprocessingGroup" xmlns:wpi="http://schemas.microsoft.com/office/word/2010/wordprocessingInk" xmlns:wne="http://schemas.microsoft.com/office/word/2006/wordml" xmlns:wps="http://schemas.microsoft.com/office/word/2010/wordprocessingShape" mc:Ignorable="w14 w15 w16se w16cid w16 w16cex w16sdtdh w16sdtfl w16du wp14">
+<w:document xmlns:o="urn:schemas-microsoft-com:office:office" xmlns:r="http://schemas.openxmlformats.org/officeDocument/2006/relationships" xmlns:v="urn:schemas-microsoft-com:vml" xmlns:w="http://schemas.openxmlformats.org/wordprocessingml/2006/main" xmlns:w10="urn:schemas-microsoft-com:office:word" xmlns:wp="http://schemas.openxmlformats.org/drawingml/2006/wordprocessingDrawing" xmlns:wps="http://schemas.microsoft.com/office/word/2010/wordprocessingShape" xmlns:wpg="http://schemas.microsoft.com/office/word/2010/wordprocessingGroup" xmlns:mc="http://schemas.openxmlformats.org/markup-compatibility/2006" xmlns:wp14="http://schemas.microsoft.com/office/word/2010/wordprocessingDrawing" xmlns:w14="http://schemas.microsoft.com/office/word/2010/wordml" xmlns:w15="http://schemas.microsoft.com/office/word/2012/wordml" mc:Ignorable="w14 wp14 w15">
   <w:body>
     <w:tbl>
       <w:tblPr>
-        <w:tblW w:w="0" w:type="auto"/>
+        <w:tblW w:w="8745" w:type="dxa"/>
+        <w:jc w:val="left"/>
         <w:tblInd w:w="279" w:type="dxa"/>
-        <w:tblBorders>
-          <w:top w:val="single" w:sz="18" w:space="0" w:color="233D81"/>
-          <w:left w:val="single" w:sz="18" w:space="0" w:color="233D81"/>
-          <w:bottom w:val="single" w:sz="18" w:space="0" w:color="233D81"/>
-          <w:right w:val="single" w:sz="18" w:space="0" w:color="233D81"/>
-          <w:insideH w:val="single" w:sz="18" w:space="0" w:color="233D81"/>
-          <w:insideV w:val="single" w:sz="18" w:space="0" w:color="233D81"/>
-        </w:tblBorders>
-        <w:tblLook w:val="04A0" w:firstRow="1" w:lastRow="0" w:firstColumn="1" w:lastColumn="0" w:noHBand="0" w:noVBand="1"/>
+        <w:tblLayout w:type="fixed"/>
+        <w:tblCellMar>
+          <w:top w:w="0" w:type="dxa"/>
+          <w:left w:w="108" w:type="dxa"/>
+          <w:bottom w:w="0" w:type="dxa"/>
+          <w:right w:w="108" w:type="dxa"/>
+        </w:tblCellMar>
+        <w:tblLook w:val="04a0" w:noHBand="0" w:noVBand="1" w:firstColumn="1" w:lastRow="0" w:lastColumn="0" w:firstRow="1"/>
       </w:tblPr>
       <w:tblGrid>
         <w:gridCol w:w="1672"/>
-        <w:gridCol w:w="7073"/>
+        <w:gridCol w:w="7072"/>
       </w:tblGrid>
       <w:tr>
+        <w:trPr/>
         <w:tc>
           <w:tcPr>
             <w:tcW w:w="1672" w:type="dxa"/>
             <w:tcBorders>
-              <w:right w:val="nil"/>
+              <w:top w:val="single" w:sz="18" w:space="0" w:color="233D81"/>
+              <w:left w:val="single" w:sz="18" w:space="0" w:color="233D81"/>
+              <w:bottom w:val="single" w:sz="18" w:space="0" w:color="233D81"/>
             </w:tcBorders>
           </w:tcPr>
           <w:p>
             <w:pPr>
+              <w:pStyle w:val="Normal"/>
+              <w:spacing w:before="0" w:after="120"/>
               <w:rPr>
                 <w:color w:val="233D81"/>
               </w:rPr>
@@ -44,13 +49,17 @@
         </w:tc>
         <w:tc>
           <w:tcPr>
-            <w:tcW w:w="7073" w:type="dxa"/>
+            <w:tcW w:w="7072" w:type="dxa"/>
             <w:tcBorders>
-              <w:left w:val="nil"/>
+              <w:top w:val="single" w:sz="18" w:space="0" w:color="233D81"/>
+              <w:bottom w:val="single" w:sz="18" w:space="0" w:color="233D81"/>
+              <w:right w:val="single" w:sz="18" w:space="0" w:color="233D81"/>
             </w:tcBorders>
           </w:tcPr>
           <w:p>
             <w:pPr>
+              <w:pStyle w:val="Normal"/>
+              <w:spacing w:before="0" w:after="120"/>
               <w:rPr>
                 <w:color w:val="000000"/>
               </w:rPr>
@@ -65,13 +74,22 @@
         </w:tc>
       </w:tr>
       <w:tr>
+        <w:trPr/>
         <w:tc>
           <w:tcPr>
-            <w:tcW w:w="8745" w:type="dxa"/>
+            <w:tcW w:w="8744" w:type="dxa"/>
             <w:gridSpan w:val="2"/>
+            <w:tcBorders>
+              <w:top w:val="single" w:sz="18" w:space="0" w:color="233D81"/>
+              <w:left w:val="single" w:sz="18" w:space="0" w:color="233D81"/>
+              <w:bottom w:val="single" w:sz="18" w:space="0" w:color="233D81"/>
+              <w:right w:val="single" w:sz="18" w:space="0" w:color="233D81"/>
+            </w:tcBorders>
           </w:tcPr>
           <w:p>
             <w:pPr>
+              <w:pStyle w:val="Normal"/>
+              <w:spacing w:before="0" w:after="120"/>
               <w:rPr>
                 <w:color w:val="233D81"/>
               </w:rPr>
@@ -87,15 +105,22 @@
       </w:tr>
       <w:tr>
         <w:trPr>
-          <w:trHeight w:val="563"/>
+          <w:trHeight w:val="563" w:hRule="atLeast"/>
         </w:trPr>
         <w:tc>
           <w:tcPr>
-            <w:tcW w:w="8745" w:type="dxa"/>
+            <w:tcW w:w="8744" w:type="dxa"/>
             <w:gridSpan w:val="2"/>
+            <w:tcBorders>
+              <w:top w:val="single" w:sz="18" w:space="0" w:color="233D81"/>
+              <w:left w:val="single" w:sz="18" w:space="0" w:color="233D81"/>
+              <w:bottom w:val="single" w:sz="18" w:space="0" w:color="233D81"/>
+              <w:right w:val="single" w:sz="18" w:space="0" w:color="233D81"/>
+            </w:tcBorders>
           </w:tcPr>
           <w:p>
             <w:pPr>
+              <w:pStyle w:val="Normal"/>
               <w:jc w:val="left"/>
               <w:rPr>
                 <w:rFonts w:ascii="Roboto" w:hAnsi="Roboto"/>
@@ -105,13 +130,8 @@
               </w:rPr>
             </w:pPr>
             <w:r>
-              <w:t>Dr</w:t>
-            </w:r>
-            <w:r>
-              <w:t xml:space="preserve"> hab.</w:t>
-            </w:r>
-            <w:r>
-              <w:t>/</w:t>
+              <w:rPr/>
+              <w:t>Dr hab./</w:t>
             </w:r>
             <w:r>
               <w:rPr>
@@ -119,7 +139,7 @@
                 <w:color w:val="121212"/>
                 <w:sz w:val="21"/>
                 <w:szCs w:val="21"/>
-                <w:shd w:val="clear" w:color="auto" w:fill="F4F5FD"/>
+                <w:shd w:fill="F4F5FD" w:val="clear"/>
               </w:rPr>
               <w:t xml:space="preserve"> </w:t>
             </w:r>
@@ -130,29 +150,13 @@
                 <w:sz w:val="21"/>
                 <w:szCs w:val="21"/>
               </w:rPr>
-              <w:t>dziedzina nauk matematycznych / matematyka</w:t>
-            </w:r>
-            <w:r>
-              <w:rPr>
-                <w:rFonts w:ascii="Roboto" w:hAnsi="Roboto"/>
-                <w:color w:val="121212"/>
-                <w:sz w:val="21"/>
-                <w:szCs w:val="21"/>
-              </w:rPr>
-              <w:t>, 200</w:t>
-            </w:r>
-            <w:r>
-              <w:rPr>
-                <w:rFonts w:ascii="Roboto" w:hAnsi="Roboto"/>
-                <w:color w:val="121212"/>
-                <w:sz w:val="21"/>
-                <w:szCs w:val="21"/>
-              </w:rPr>
-              <w:t>7</w:t>
+              <w:t>dziedzina nauk matematycznych / matematyka, 2007</w:t>
             </w:r>
           </w:p>
           <w:p>
             <w:pPr>
+              <w:pStyle w:val="Normal"/>
+              <w:spacing w:before="0" w:after="120"/>
               <w:jc w:val="left"/>
               <w:rPr>
                 <w:rFonts w:ascii="Roboto" w:hAnsi="Roboto"/>
@@ -161,85 +165,106 @@
                 <w:szCs w:val="21"/>
               </w:rPr>
             </w:pPr>
-          </w:p>
-        </w:tc>
-      </w:tr>
-      <w:tr>
-        <w:trPr>
-          <w:trHeight w:val="435"/>
-        </w:trPr>
-        <w:tc>
-          <w:tcPr>
-            <w:tcW w:w="8745" w:type="dxa"/>
-            <w:gridSpan w:val="2"/>
-            <w:vAlign w:val="center"/>
-          </w:tcPr>
-          <w:p>
             <w:r>
               <w:rPr>
-                <w:color w:val="233D81"/>
+                <w:rFonts w:ascii="Roboto" w:hAnsi="Roboto"/>
+                <w:color w:val="121212"/>
+                <w:sz w:val="21"/>
+                <w:szCs w:val="21"/>
               </w:rPr>
-              <w:t>Wykaz zajęć/grup zajęć i godzin zajęć prowadzonych na ocenianym kierunku przez nauczyciela akademickiego lub inną osobę w</w:t>
-            </w:r>
-            <w:r>
-              <w:rPr>
-                <w:color w:val="233D81"/>
-              </w:rPr>
-              <w:t xml:space="preserve"> </w:t>
-            </w:r>
-            <w:r>
-              <w:rPr>
-                <w:color w:val="233D81"/>
-              </w:rPr>
-              <w:t>roku akademickim, w którym przeprowadzana jest ocena.</w:t>
             </w:r>
           </w:p>
         </w:tc>
       </w:tr>
       <w:tr>
         <w:trPr>
-          <w:trHeight w:val="563"/>
+          <w:trHeight w:val="435" w:hRule="atLeast"/>
         </w:trPr>
         <w:tc>
           <w:tcPr>
-            <w:tcW w:w="8745" w:type="dxa"/>
+            <w:tcW w:w="8744" w:type="dxa"/>
             <w:gridSpan w:val="2"/>
+            <w:tcBorders>
+              <w:top w:val="single" w:sz="18" w:space="0" w:color="233D81"/>
+              <w:left w:val="single" w:sz="18" w:space="0" w:color="233D81"/>
+              <w:bottom w:val="single" w:sz="18" w:space="0" w:color="233D81"/>
+              <w:right w:val="single" w:sz="18" w:space="0" w:color="233D81"/>
+            </w:tcBorders>
+            <w:vAlign w:val="center"/>
+          </w:tcPr>
+          <w:p>
+            <w:pPr>
+              <w:pStyle w:val="Normal"/>
+              <w:widowControl/>
+              <w:bidi w:val="0"/>
+              <w:spacing w:lineRule="auto" w:line="240" w:before="0" w:after="120"/>
+              <w:jc w:val="both"/>
+              <w:rPr/>
+            </w:pPr>
+            <w:r>
+              <w:rPr>
+                <w:color w:val="233D81"/>
+              </w:rPr>
+              <w:t>Wykaz zajęć/grup zajęć i godzin zajęć prowadzonych na ocenianym kierunku przez nauczyciela akademickiego lub inną osobę w roku akademickim, w którym przeprowadzana jest ocena.</w:t>
+            </w:r>
+          </w:p>
+        </w:tc>
+      </w:tr>
+      <w:tr>
+        <w:trPr>
+          <w:trHeight w:val="563" w:hRule="atLeast"/>
+        </w:trPr>
+        <w:tc>
+          <w:tcPr>
+            <w:tcW w:w="8744" w:type="dxa"/>
+            <w:gridSpan w:val="2"/>
+            <w:tcBorders>
+              <w:top w:val="single" w:sz="18" w:space="0" w:color="233D81"/>
+              <w:left w:val="single" w:sz="18" w:space="0" w:color="233D81"/>
+              <w:bottom w:val="single" w:sz="18" w:space="0" w:color="233D81"/>
+              <w:right w:val="single" w:sz="18" w:space="0" w:color="233D81"/>
+            </w:tcBorders>
           </w:tcPr>
           <w:tbl>
             <w:tblPr>
               <w:tblW w:w="7920" w:type="dxa"/>
+              <w:jc w:val="left"/>
+              <w:tblInd w:w="0" w:type="dxa"/>
+              <w:tblLayout w:type="fixed"/>
               <w:tblCellMar>
+                <w:top w:w="0" w:type="dxa"/>
                 <w:left w:w="70" w:type="dxa"/>
+                <w:bottom w:w="0" w:type="dxa"/>
                 <w:right w:w="70" w:type="dxa"/>
               </w:tblCellMar>
-              <w:tblLook w:val="04A0" w:firstRow="1" w:lastRow="0" w:firstColumn="1" w:lastColumn="0" w:noHBand="0" w:noVBand="1"/>
+              <w:tblLook w:val="04a0" w:noHBand="0" w:noVBand="1" w:firstColumn="1" w:lastRow="0" w:lastColumn="0" w:firstRow="1"/>
             </w:tblPr>
             <w:tblGrid>
               <w:gridCol w:w="3720"/>
               <w:gridCol w:w="1420"/>
-              <w:gridCol w:w="1380"/>
+              <w:gridCol w:w="1379"/>
               <w:gridCol w:w="1400"/>
             </w:tblGrid>
             <w:tr>
               <w:trPr>
-                <w:trHeight w:val="300"/>
+                <w:trHeight w:val="300" w:hRule="atLeast"/>
               </w:trPr>
               <w:tc>
                 <w:tcPr>
                   <w:tcW w:w="3720" w:type="dxa"/>
                   <w:tcBorders>
-                    <w:top w:val="single" w:sz="4" w:space="0" w:color="auto"/>
-                    <w:left w:val="single" w:sz="4" w:space="0" w:color="auto"/>
-                    <w:bottom w:val="single" w:sz="4" w:space="0" w:color="auto"/>
-                    <w:right w:val="single" w:sz="4" w:space="0" w:color="auto"/>
+                    <w:top w:val="single" w:sz="4" w:space="0" w:color="000000"/>
+                    <w:left w:val="single" w:sz="4" w:space="0" w:color="000000"/>
+                    <w:bottom w:val="single" w:sz="4" w:space="0" w:color="000000"/>
+                    <w:right w:val="single" w:sz="4" w:space="0" w:color="000000"/>
                   </w:tcBorders>
-                  <w:shd w:val="clear" w:color="000000" w:fill="FFFF00"/>
+                  <w:shd w:color="000000" w:fill="FFFF00" w:val="clear"/>
                   <w:vAlign w:val="bottom"/>
-                  <w:hideMark/>
                 </w:tcPr>
                 <w:p>
                   <w:pPr>
-                    <w:spacing w:after="0"/>
+                    <w:pStyle w:val="Normal"/>
+                    <w:spacing w:before="0" w:after="0"/>
                     <w:jc w:val="center"/>
                     <w:rPr>
                       <w:rFonts w:cs="Calibri"/>
@@ -259,18 +284,17 @@
                 <w:tcPr>
                   <w:tcW w:w="1420" w:type="dxa"/>
                   <w:tcBorders>
-                    <w:top w:val="single" w:sz="4" w:space="0" w:color="auto"/>
-                    <w:left w:val="nil"/>
-                    <w:bottom w:val="single" w:sz="4" w:space="0" w:color="auto"/>
-                    <w:right w:val="single" w:sz="4" w:space="0" w:color="auto"/>
+                    <w:top w:val="single" w:sz="4" w:space="0" w:color="000000"/>
+                    <w:bottom w:val="single" w:sz="4" w:space="0" w:color="000000"/>
+                    <w:right w:val="single" w:sz="4" w:space="0" w:color="000000"/>
                   </w:tcBorders>
-                  <w:shd w:val="clear" w:color="000000" w:fill="FFFF00"/>
+                  <w:shd w:color="000000" w:fill="FFFF00" w:val="clear"/>
                   <w:vAlign w:val="bottom"/>
-                  <w:hideMark/>
                 </w:tcPr>
                 <w:p>
                   <w:pPr>
-                    <w:spacing w:after="0"/>
+                    <w:pStyle w:val="Normal"/>
+                    <w:spacing w:before="0" w:after="0"/>
                     <w:jc w:val="center"/>
                     <w:rPr>
                       <w:rFonts w:cs="Calibri"/>
@@ -288,20 +312,19 @@
               </w:tc>
               <w:tc>
                 <w:tcPr>
-                  <w:tcW w:w="1380" w:type="dxa"/>
+                  <w:tcW w:w="1379" w:type="dxa"/>
                   <w:tcBorders>
-                    <w:top w:val="single" w:sz="4" w:space="0" w:color="auto"/>
-                    <w:left w:val="nil"/>
-                    <w:bottom w:val="single" w:sz="4" w:space="0" w:color="auto"/>
-                    <w:right w:val="single" w:sz="4" w:space="0" w:color="auto"/>
+                    <w:top w:val="single" w:sz="4" w:space="0" w:color="000000"/>
+                    <w:bottom w:val="single" w:sz="4" w:space="0" w:color="000000"/>
+                    <w:right w:val="single" w:sz="4" w:space="0" w:color="000000"/>
                   </w:tcBorders>
-                  <w:shd w:val="clear" w:color="000000" w:fill="FFFF00"/>
+                  <w:shd w:color="000000" w:fill="FFFF00" w:val="clear"/>
                   <w:vAlign w:val="bottom"/>
-                  <w:hideMark/>
                 </w:tcPr>
                 <w:p>
                   <w:pPr>
-                    <w:spacing w:after="0"/>
+                    <w:pStyle w:val="Normal"/>
+                    <w:spacing w:before="0" w:after="0"/>
                     <w:jc w:val="center"/>
                     <w:rPr>
                       <w:rFonts w:cs="Calibri"/>
@@ -321,18 +344,17 @@
                 <w:tcPr>
                   <w:tcW w:w="1400" w:type="dxa"/>
                   <w:tcBorders>
-                    <w:top w:val="single" w:sz="4" w:space="0" w:color="auto"/>
-                    <w:left w:val="nil"/>
-                    <w:bottom w:val="single" w:sz="4" w:space="0" w:color="auto"/>
-                    <w:right w:val="single" w:sz="4" w:space="0" w:color="auto"/>
+                    <w:top w:val="single" w:sz="4" w:space="0" w:color="000000"/>
+                    <w:bottom w:val="single" w:sz="4" w:space="0" w:color="000000"/>
+                    <w:right w:val="single" w:sz="4" w:space="0" w:color="000000"/>
                   </w:tcBorders>
-                  <w:shd w:val="clear" w:color="000000" w:fill="FFFF00"/>
+                  <w:shd w:color="000000" w:fill="FFFF00" w:val="clear"/>
                   <w:vAlign w:val="bottom"/>
-                  <w:hideMark/>
                 </w:tcPr>
                 <w:p>
                   <w:pPr>
-                    <w:spacing w:after="0"/>
+                    <w:pStyle w:val="Normal"/>
+                    <w:spacing w:before="0" w:after="0"/>
                     <w:jc w:val="center"/>
                     <w:rPr>
                       <w:rFonts w:cs="Calibri"/>
@@ -351,25 +373,23 @@
             </w:tr>
             <w:tr>
               <w:trPr>
-                <w:trHeight w:val="300"/>
+                <w:trHeight w:val="300" w:hRule="atLeast"/>
               </w:trPr>
               <w:tc>
                 <w:tcPr>
                   <w:tcW w:w="3720" w:type="dxa"/>
                   <w:tcBorders>
-                    <w:top w:val="nil"/>
-                    <w:left w:val="single" w:sz="4" w:space="0" w:color="auto"/>
-                    <w:bottom w:val="single" w:sz="4" w:space="0" w:color="auto"/>
-                    <w:right w:val="single" w:sz="4" w:space="0" w:color="auto"/>
+                    <w:left w:val="single" w:sz="4" w:space="0" w:color="000000"/>
+                    <w:bottom w:val="single" w:sz="4" w:space="0" w:color="000000"/>
+                    <w:right w:val="single" w:sz="4" w:space="0" w:color="000000"/>
                   </w:tcBorders>
-                  <w:shd w:val="clear" w:color="000000" w:fill="FFFFFF"/>
-                  <w:noWrap/>
+                  <w:shd w:color="000000" w:fill="FFFFFF" w:val="clear"/>
                   <w:vAlign w:val="bottom"/>
-                  <w:hideMark/>
                 </w:tcPr>
                 <w:p>
                   <w:pPr>
-                    <w:spacing w:after="0"/>
+                    <w:pStyle w:val="Normal"/>
+                    <w:spacing w:before="0" w:after="0"/>
                     <w:jc w:val="left"/>
                     <w:rPr>
                       <w:rFonts w:ascii="Arial" w:hAnsi="Arial" w:cs="Arial"/>
@@ -379,7 +399,7 @@
                   </w:pPr>
                   <w:r>
                     <w:rPr>
-                      <w:rFonts w:ascii="Arial" w:hAnsi="Arial" w:cs="Arial"/>
+                      <w:rFonts w:cs="Arial" w:ascii="Arial" w:hAnsi="Arial"/>
                       <w:sz w:val="20"/>
                       <w:szCs w:val="20"/>
                     </w:rPr>
@@ -391,19 +411,16 @@
                 <w:tcPr>
                   <w:tcW w:w="1420" w:type="dxa"/>
                   <w:tcBorders>
-                    <w:top w:val="nil"/>
-                    <w:left w:val="nil"/>
-                    <w:bottom w:val="single" w:sz="4" w:space="0" w:color="auto"/>
-                    <w:right w:val="single" w:sz="4" w:space="0" w:color="auto"/>
+                    <w:bottom w:val="single" w:sz="4" w:space="0" w:color="000000"/>
+                    <w:right w:val="single" w:sz="4" w:space="0" w:color="000000"/>
                   </w:tcBorders>
-                  <w:shd w:val="clear" w:color="000000" w:fill="FFFFFF"/>
-                  <w:noWrap/>
+                  <w:shd w:color="000000" w:fill="FFFFFF" w:val="clear"/>
                   <w:vAlign w:val="bottom"/>
-                  <w:hideMark/>
                 </w:tcPr>
                 <w:p>
                   <w:pPr>
-                    <w:spacing w:after="0"/>
+                    <w:pStyle w:val="Normal"/>
+                    <w:spacing w:before="0" w:after="0"/>
                     <w:jc w:val="center"/>
                     <w:rPr>
                       <w:rFonts w:ascii="Arial" w:hAnsi="Arial" w:cs="Arial"/>
@@ -413,7 +430,7 @@
                   </w:pPr>
                   <w:r>
                     <w:rPr>
-                      <w:rFonts w:ascii="Arial" w:hAnsi="Arial" w:cs="Arial"/>
+                      <w:rFonts w:cs="Arial" w:ascii="Arial" w:hAnsi="Arial"/>
                       <w:sz w:val="20"/>
                       <w:szCs w:val="20"/>
                     </w:rPr>
@@ -423,21 +440,18 @@
               </w:tc>
               <w:tc>
                 <w:tcPr>
-                  <w:tcW w:w="1380" w:type="dxa"/>
+                  <w:tcW w:w="1379" w:type="dxa"/>
                   <w:tcBorders>
-                    <w:top w:val="nil"/>
-                    <w:left w:val="nil"/>
-                    <w:bottom w:val="single" w:sz="4" w:space="0" w:color="auto"/>
-                    <w:right w:val="single" w:sz="4" w:space="0" w:color="auto"/>
+                    <w:bottom w:val="single" w:sz="4" w:space="0" w:color="000000"/>
+                    <w:right w:val="single" w:sz="4" w:space="0" w:color="000000"/>
                   </w:tcBorders>
-                  <w:shd w:val="clear" w:color="000000" w:fill="FFFFFF"/>
-                  <w:noWrap/>
+                  <w:shd w:color="000000" w:fill="FFFFFF" w:val="clear"/>
                   <w:vAlign w:val="bottom"/>
-                  <w:hideMark/>
                 </w:tcPr>
                 <w:p>
                   <w:pPr>
-                    <w:spacing w:after="0"/>
+                    <w:pStyle w:val="Normal"/>
+                    <w:spacing w:before="0" w:after="0"/>
                     <w:jc w:val="center"/>
                     <w:rPr>
                       <w:rFonts w:ascii="Arial" w:hAnsi="Arial" w:cs="Arial"/>
@@ -447,7 +461,7 @@
                   </w:pPr>
                   <w:r>
                     <w:rPr>
-                      <w:rFonts w:ascii="Arial" w:hAnsi="Arial" w:cs="Arial"/>
+                      <w:rFonts w:cs="Arial" w:ascii="Arial" w:hAnsi="Arial"/>
                       <w:sz w:val="20"/>
                       <w:szCs w:val="20"/>
                     </w:rPr>
@@ -459,19 +473,16 @@
                 <w:tcPr>
                   <w:tcW w:w="1400" w:type="dxa"/>
                   <w:tcBorders>
-                    <w:top w:val="nil"/>
-                    <w:left w:val="nil"/>
-                    <w:bottom w:val="single" w:sz="4" w:space="0" w:color="auto"/>
-                    <w:right w:val="single" w:sz="4" w:space="0" w:color="auto"/>
+                    <w:bottom w:val="single" w:sz="4" w:space="0" w:color="000000"/>
+                    <w:right w:val="single" w:sz="4" w:space="0" w:color="000000"/>
                   </w:tcBorders>
-                  <w:shd w:val="clear" w:color="000000" w:fill="FFFFFF"/>
-                  <w:noWrap/>
+                  <w:shd w:color="000000" w:fill="FFFFFF" w:val="clear"/>
                   <w:vAlign w:val="bottom"/>
-                  <w:hideMark/>
                 </w:tcPr>
                 <w:p>
                   <w:pPr>
-                    <w:spacing w:after="0"/>
+                    <w:pStyle w:val="Normal"/>
+                    <w:spacing w:before="0" w:after="0"/>
                     <w:jc w:val="center"/>
                     <w:rPr>
                       <w:rFonts w:ascii="Arial" w:hAnsi="Arial" w:cs="Arial"/>
@@ -481,7 +492,7 @@
                   </w:pPr>
                   <w:r>
                     <w:rPr>
-                      <w:rFonts w:ascii="Arial" w:hAnsi="Arial" w:cs="Arial"/>
+                      <w:rFonts w:cs="Arial" w:ascii="Arial" w:hAnsi="Arial"/>
                       <w:sz w:val="20"/>
                       <w:szCs w:val="20"/>
                     </w:rPr>
@@ -492,25 +503,23 @@
             </w:tr>
             <w:tr>
               <w:trPr>
-                <w:trHeight w:val="300"/>
+                <w:trHeight w:val="300" w:hRule="atLeast"/>
               </w:trPr>
               <w:tc>
                 <w:tcPr>
                   <w:tcW w:w="3720" w:type="dxa"/>
                   <w:tcBorders>
-                    <w:top w:val="nil"/>
-                    <w:left w:val="single" w:sz="4" w:space="0" w:color="auto"/>
-                    <w:bottom w:val="single" w:sz="4" w:space="0" w:color="auto"/>
-                    <w:right w:val="single" w:sz="4" w:space="0" w:color="auto"/>
+                    <w:left w:val="single" w:sz="4" w:space="0" w:color="000000"/>
+                    <w:bottom w:val="single" w:sz="4" w:space="0" w:color="000000"/>
+                    <w:right w:val="single" w:sz="4" w:space="0" w:color="000000"/>
                   </w:tcBorders>
-                  <w:shd w:val="clear" w:color="E2EFDA" w:fill="FFFFFF"/>
-                  <w:noWrap/>
+                  <w:shd w:color="E2EFDA" w:fill="FFFFFF" w:val="clear"/>
                   <w:vAlign w:val="bottom"/>
-                  <w:hideMark/>
                 </w:tcPr>
                 <w:p>
                   <w:pPr>
-                    <w:spacing w:after="0"/>
+                    <w:pStyle w:val="Normal"/>
+                    <w:spacing w:before="0" w:after="0"/>
                     <w:jc w:val="left"/>
                     <w:rPr>
                       <w:rFonts w:ascii="Arial" w:hAnsi="Arial" w:cs="Arial"/>
@@ -520,7 +529,7 @@
                   </w:pPr>
                   <w:r>
                     <w:rPr>
-                      <w:rFonts w:ascii="Arial" w:hAnsi="Arial" w:cs="Arial"/>
+                      <w:rFonts w:cs="Arial" w:ascii="Arial" w:hAnsi="Arial"/>
                       <w:sz w:val="20"/>
                       <w:szCs w:val="20"/>
                     </w:rPr>
@@ -532,19 +541,16 @@
                 <w:tcPr>
                   <w:tcW w:w="1420" w:type="dxa"/>
                   <w:tcBorders>
-                    <w:top w:val="nil"/>
-                    <w:left w:val="nil"/>
-                    <w:bottom w:val="single" w:sz="4" w:space="0" w:color="auto"/>
-                    <w:right w:val="single" w:sz="4" w:space="0" w:color="auto"/>
+                    <w:bottom w:val="single" w:sz="4" w:space="0" w:color="000000"/>
+                    <w:right w:val="single" w:sz="4" w:space="0" w:color="000000"/>
                   </w:tcBorders>
-                  <w:shd w:val="clear" w:color="E2EFDA" w:fill="FFFFFF"/>
-                  <w:noWrap/>
+                  <w:shd w:color="E2EFDA" w:fill="FFFFFF" w:val="clear"/>
                   <w:vAlign w:val="bottom"/>
-                  <w:hideMark/>
                 </w:tcPr>
                 <w:p>
                   <w:pPr>
-                    <w:spacing w:after="0"/>
+                    <w:pStyle w:val="Normal"/>
+                    <w:spacing w:before="0" w:after="0"/>
                     <w:jc w:val="center"/>
                     <w:rPr>
                       <w:rFonts w:ascii="Arial" w:hAnsi="Arial" w:cs="Arial"/>
@@ -554,7 +560,7 @@
                   </w:pPr>
                   <w:r>
                     <w:rPr>
-                      <w:rFonts w:ascii="Arial" w:hAnsi="Arial" w:cs="Arial"/>
+                      <w:rFonts w:cs="Arial" w:ascii="Arial" w:hAnsi="Arial"/>
                       <w:sz w:val="20"/>
                       <w:szCs w:val="20"/>
                     </w:rPr>
@@ -564,21 +570,18 @@
               </w:tc>
               <w:tc>
                 <w:tcPr>
-                  <w:tcW w:w="1380" w:type="dxa"/>
+                  <w:tcW w:w="1379" w:type="dxa"/>
                   <w:tcBorders>
-                    <w:top w:val="nil"/>
-                    <w:left w:val="nil"/>
-                    <w:bottom w:val="single" w:sz="4" w:space="0" w:color="auto"/>
-                    <w:right w:val="single" w:sz="4" w:space="0" w:color="auto"/>
+                    <w:bottom w:val="single" w:sz="4" w:space="0" w:color="000000"/>
+                    <w:right w:val="single" w:sz="4" w:space="0" w:color="000000"/>
                   </w:tcBorders>
-                  <w:shd w:val="clear" w:color="E2EFDA" w:fill="FFFFFF"/>
-                  <w:noWrap/>
+                  <w:shd w:color="E2EFDA" w:fill="FFFFFF" w:val="clear"/>
                   <w:vAlign w:val="bottom"/>
-                  <w:hideMark/>
                 </w:tcPr>
                 <w:p>
                   <w:pPr>
-                    <w:spacing w:after="0"/>
+                    <w:pStyle w:val="Normal"/>
+                    <w:spacing w:before="0" w:after="0"/>
                     <w:jc w:val="center"/>
                     <w:rPr>
                       <w:rFonts w:ascii="Arial" w:hAnsi="Arial" w:cs="Arial"/>
@@ -588,7 +591,7 @@
                   </w:pPr>
                   <w:r>
                     <w:rPr>
-                      <w:rFonts w:ascii="Arial" w:hAnsi="Arial" w:cs="Arial"/>
+                      <w:rFonts w:cs="Arial" w:ascii="Arial" w:hAnsi="Arial"/>
                       <w:sz w:val="20"/>
                       <w:szCs w:val="20"/>
                     </w:rPr>
@@ -600,19 +603,16 @@
                 <w:tcPr>
                   <w:tcW w:w="1400" w:type="dxa"/>
                   <w:tcBorders>
-                    <w:top w:val="nil"/>
-                    <w:left w:val="nil"/>
-                    <w:bottom w:val="single" w:sz="4" w:space="0" w:color="auto"/>
-                    <w:right w:val="single" w:sz="4" w:space="0" w:color="auto"/>
+                    <w:bottom w:val="single" w:sz="4" w:space="0" w:color="000000"/>
+                    <w:right w:val="single" w:sz="4" w:space="0" w:color="000000"/>
                   </w:tcBorders>
-                  <w:shd w:val="clear" w:color="E2EFDA" w:fill="FFFFFF"/>
-                  <w:noWrap/>
+                  <w:shd w:color="E2EFDA" w:fill="FFFFFF" w:val="clear"/>
                   <w:vAlign w:val="bottom"/>
-                  <w:hideMark/>
                 </w:tcPr>
                 <w:p>
                   <w:pPr>
-                    <w:spacing w:after="0"/>
+                    <w:pStyle w:val="Normal"/>
+                    <w:spacing w:before="0" w:after="0"/>
                     <w:jc w:val="center"/>
                     <w:rPr>
                       <w:rFonts w:ascii="Arial" w:hAnsi="Arial" w:cs="Arial"/>
@@ -622,7 +622,7 @@
                   </w:pPr>
                   <w:r>
                     <w:rPr>
-                      <w:rFonts w:ascii="Arial" w:hAnsi="Arial" w:cs="Arial"/>
+                      <w:rFonts w:cs="Arial" w:ascii="Arial" w:hAnsi="Arial"/>
                       <w:sz w:val="20"/>
                       <w:szCs w:val="20"/>
                     </w:rPr>
@@ -633,25 +633,23 @@
             </w:tr>
             <w:tr>
               <w:trPr>
-                <w:trHeight w:val="300"/>
+                <w:trHeight w:val="300" w:hRule="atLeast"/>
               </w:trPr>
               <w:tc>
                 <w:tcPr>
                   <w:tcW w:w="3720" w:type="dxa"/>
                   <w:tcBorders>
-                    <w:top w:val="nil"/>
-                    <w:left w:val="single" w:sz="4" w:space="0" w:color="auto"/>
-                    <w:bottom w:val="single" w:sz="4" w:space="0" w:color="auto"/>
-                    <w:right w:val="single" w:sz="4" w:space="0" w:color="auto"/>
+                    <w:left w:val="single" w:sz="4" w:space="0" w:color="000000"/>
+                    <w:bottom w:val="single" w:sz="4" w:space="0" w:color="000000"/>
+                    <w:right w:val="single" w:sz="4" w:space="0" w:color="000000"/>
                   </w:tcBorders>
-                  <w:shd w:val="clear" w:color="000000" w:fill="FFFFFF"/>
-                  <w:noWrap/>
+                  <w:shd w:color="000000" w:fill="FFFFFF" w:val="clear"/>
                   <w:vAlign w:val="bottom"/>
-                  <w:hideMark/>
                 </w:tcPr>
                 <w:p>
                   <w:pPr>
-                    <w:spacing w:after="0"/>
+                    <w:pStyle w:val="Normal"/>
+                    <w:spacing w:before="0" w:after="0"/>
                     <w:jc w:val="left"/>
                     <w:rPr>
                       <w:rFonts w:ascii="Arial" w:hAnsi="Arial" w:cs="Arial"/>
@@ -661,7 +659,7 @@
                   </w:pPr>
                   <w:r>
                     <w:rPr>
-                      <w:rFonts w:ascii="Arial" w:hAnsi="Arial" w:cs="Arial"/>
+                      <w:rFonts w:cs="Arial" w:ascii="Arial" w:hAnsi="Arial"/>
                       <w:sz w:val="20"/>
                       <w:szCs w:val="20"/>
                     </w:rPr>
@@ -673,19 +671,16 @@
                 <w:tcPr>
                   <w:tcW w:w="1420" w:type="dxa"/>
                   <w:tcBorders>
-                    <w:top w:val="nil"/>
-                    <w:left w:val="nil"/>
-                    <w:bottom w:val="single" w:sz="4" w:space="0" w:color="auto"/>
-                    <w:right w:val="single" w:sz="4" w:space="0" w:color="auto"/>
+                    <w:bottom w:val="single" w:sz="4" w:space="0" w:color="000000"/>
+                    <w:right w:val="single" w:sz="4" w:space="0" w:color="000000"/>
                   </w:tcBorders>
-                  <w:shd w:val="clear" w:color="000000" w:fill="FFFFFF"/>
-                  <w:noWrap/>
+                  <w:shd w:color="000000" w:fill="FFFFFF" w:val="clear"/>
                   <w:vAlign w:val="bottom"/>
-                  <w:hideMark/>
                 </w:tcPr>
                 <w:p>
                   <w:pPr>
-                    <w:spacing w:after="0"/>
+                    <w:pStyle w:val="Normal"/>
+                    <w:spacing w:before="0" w:after="0"/>
                     <w:jc w:val="center"/>
                     <w:rPr>
                       <w:rFonts w:ascii="Arial" w:hAnsi="Arial" w:cs="Arial"/>
@@ -695,7 +690,7 @@
                   </w:pPr>
                   <w:r>
                     <w:rPr>
-                      <w:rFonts w:ascii="Arial" w:hAnsi="Arial" w:cs="Arial"/>
+                      <w:rFonts w:cs="Arial" w:ascii="Arial" w:hAnsi="Arial"/>
                       <w:sz w:val="20"/>
                       <w:szCs w:val="20"/>
                     </w:rPr>
@@ -705,21 +700,18 @@
               </w:tc>
               <w:tc>
                 <w:tcPr>
-                  <w:tcW w:w="1380" w:type="dxa"/>
+                  <w:tcW w:w="1379" w:type="dxa"/>
                   <w:tcBorders>
-                    <w:top w:val="nil"/>
-                    <w:left w:val="nil"/>
-                    <w:bottom w:val="single" w:sz="4" w:space="0" w:color="auto"/>
-                    <w:right w:val="single" w:sz="4" w:space="0" w:color="auto"/>
+                    <w:bottom w:val="single" w:sz="4" w:space="0" w:color="000000"/>
+                    <w:right w:val="single" w:sz="4" w:space="0" w:color="000000"/>
                   </w:tcBorders>
-                  <w:shd w:val="clear" w:color="000000" w:fill="FFFFFF"/>
-                  <w:noWrap/>
+                  <w:shd w:color="000000" w:fill="FFFFFF" w:val="clear"/>
                   <w:vAlign w:val="bottom"/>
-                  <w:hideMark/>
                 </w:tcPr>
                 <w:p>
                   <w:pPr>
-                    <w:spacing w:after="0"/>
+                    <w:pStyle w:val="Normal"/>
+                    <w:spacing w:before="0" w:after="0"/>
                     <w:jc w:val="center"/>
                     <w:rPr>
                       <w:rFonts w:ascii="Arial" w:hAnsi="Arial" w:cs="Arial"/>
@@ -729,7 +721,7 @@
                   </w:pPr>
                   <w:r>
                     <w:rPr>
-                      <w:rFonts w:ascii="Arial" w:hAnsi="Arial" w:cs="Arial"/>
+                      <w:rFonts w:cs="Arial" w:ascii="Arial" w:hAnsi="Arial"/>
                       <w:sz w:val="20"/>
                       <w:szCs w:val="20"/>
                     </w:rPr>
@@ -741,19 +733,16 @@
                 <w:tcPr>
                   <w:tcW w:w="1400" w:type="dxa"/>
                   <w:tcBorders>
-                    <w:top w:val="nil"/>
-                    <w:left w:val="nil"/>
-                    <w:bottom w:val="single" w:sz="4" w:space="0" w:color="auto"/>
-                    <w:right w:val="single" w:sz="4" w:space="0" w:color="auto"/>
+                    <w:bottom w:val="single" w:sz="4" w:space="0" w:color="000000"/>
+                    <w:right w:val="single" w:sz="4" w:space="0" w:color="000000"/>
                   </w:tcBorders>
-                  <w:shd w:val="clear" w:color="000000" w:fill="FFFFFF"/>
-                  <w:noWrap/>
+                  <w:shd w:color="000000" w:fill="FFFFFF" w:val="clear"/>
                   <w:vAlign w:val="bottom"/>
-                  <w:hideMark/>
                 </w:tcPr>
                 <w:p>
                   <w:pPr>
-                    <w:spacing w:after="0"/>
+                    <w:pStyle w:val="Normal"/>
+                    <w:spacing w:before="0" w:after="0"/>
                     <w:jc w:val="center"/>
                     <w:rPr>
                       <w:rFonts w:ascii="Arial" w:hAnsi="Arial" w:cs="Arial"/>
@@ -763,7 +752,7 @@
                   </w:pPr>
                   <w:r>
                     <w:rPr>
-                      <w:rFonts w:ascii="Arial" w:hAnsi="Arial" w:cs="Arial"/>
+                      <w:rFonts w:cs="Arial" w:ascii="Arial" w:hAnsi="Arial"/>
                       <w:sz w:val="20"/>
                       <w:szCs w:val="20"/>
                     </w:rPr>
@@ -773,17 +762,38 @@
               </w:tc>
             </w:tr>
           </w:tbl>
-          <w:p/>
+          <w:p>
+            <w:pPr>
+              <w:pStyle w:val="Normal"/>
+              <w:widowControl/>
+              <w:bidi w:val="0"/>
+              <w:spacing w:lineRule="auto" w:line="240" w:before="0" w:after="120"/>
+              <w:jc w:val="both"/>
+              <w:rPr/>
+            </w:pPr>
+            <w:r>
+              <w:rPr/>
+            </w:r>
+          </w:p>
         </w:tc>
       </w:tr>
       <w:tr>
+        <w:trPr/>
         <w:tc>
           <w:tcPr>
-            <w:tcW w:w="8745" w:type="dxa"/>
+            <w:tcW w:w="8744" w:type="dxa"/>
             <w:gridSpan w:val="2"/>
+            <w:tcBorders>
+              <w:top w:val="single" w:sz="18" w:space="0" w:color="233D81"/>
+              <w:left w:val="single" w:sz="18" w:space="0" w:color="233D81"/>
+              <w:bottom w:val="single" w:sz="18" w:space="0" w:color="233D81"/>
+              <w:right w:val="single" w:sz="18" w:space="0" w:color="233D81"/>
+            </w:tcBorders>
           </w:tcPr>
           <w:p>
             <w:pPr>
+              <w:pStyle w:val="Normal"/>
+              <w:spacing w:before="0" w:after="120"/>
               <w:rPr>
                 <w:color w:val="233D81"/>
               </w:rPr>
@@ -792,25 +802,7 @@
               <w:rPr>
                 <w:color w:val="233D81"/>
               </w:rPr>
-              <w:t>Charakterystyka dorobku naukowego ze wskazaniem dziedzin nauki/sztuki</w:t>
-            </w:r>
-            <w:r>
-              <w:rPr>
-                <w:color w:val="233D81"/>
-              </w:rPr>
-              <w:t xml:space="preserve"> </w:t>
-            </w:r>
-            <w:r>
-              <w:rPr>
-                <w:color w:val="233D81"/>
-              </w:rPr>
-              <w:t>oraz dyscypliny/dyscyplin naukowych/artys</w:t>
-            </w:r>
-            <w:r>
-              <w:rPr>
-                <w:color w:val="233D81"/>
-              </w:rPr>
-              <w:t xml:space="preserve">tycznych, w której/których dorobek się mieści (do 600 znaków) oraz wykaz </w:t>
+              <w:t xml:space="preserve">Charakterystyka dorobku naukowego ze wskazaniem dziedzin nauki/sztuki oraz dyscypliny/dyscyplin naukowych/artystycznych, w której/których dorobek się mieści (do 600 znaków) oraz wykaz </w:t>
             </w:r>
             <w:r>
               <w:rPr>
@@ -823,61 +815,58 @@
               <w:rPr>
                 <w:color w:val="233D81"/>
               </w:rPr>
-              <w:t xml:space="preserve"> najważniejszych osiągnięć naukowych/artystycznych ze szczególnym uwzględnieniem ostatnich 6 lat,</w:t>
-            </w:r>
-            <w:r>
-              <w:rPr>
-                <w:color w:val="233D81"/>
-              </w:rPr>
-              <w:t xml:space="preserve"> </w:t>
-            </w:r>
-            <w:r>
-              <w:rPr>
-                <w:color w:val="233D81"/>
-              </w:rPr>
-              <w:t>wraz ze wska</w:t>
-            </w:r>
-            <w:r>
-              <w:rPr>
-                <w:color w:val="233D81"/>
-              </w:rPr>
-              <w:t>zaniem dat uzyskania (publikacji naukowych/osiągnięć artystycznych, patentów i praw ochronnych, zrealizowanych projektów badawczych, nagród krajowych/międzynarodowych za osiągnięcia naukowe/artystyczne), ze szczególnym uwzględnieniem osiągnięć odnoszących się do ocenianego kierunku i</w:t>
-            </w:r>
-            <w:r>
-              <w:rPr>
-                <w:color w:val="233D81"/>
-              </w:rPr>
-              <w:t> </w:t>
-            </w:r>
-            <w:r>
-              <w:rPr>
-                <w:color w:val="233D81"/>
-              </w:rPr>
-              <w:t>prowadzonych na nim zajęć.</w:t>
+              <w:t xml:space="preserve"> najważniejszych osiągnięć naukowych/artystycznych ze szczególnym uwzględnieniem ostatnich 6 lat, wraz ze wskazaniem dat uzyskania (publikacji naukowych/osiągnięć artystycznych, patentów i praw ochronnych, zrealizowanych projektów badawczych, nagród krajowych/międzynarodowych za osiągnięcia naukowe/artystyczne), ze szczególnym uwzględnieniem osiągnięć odnoszących się do ocenianego kierunku i prowadzonych na nim zajęć.</w:t>
             </w:r>
           </w:p>
         </w:tc>
       </w:tr>
       <w:tr>
         <w:trPr>
-          <w:trHeight w:val="500"/>
+          <w:trHeight w:val="500" w:hRule="atLeast"/>
         </w:trPr>
         <w:tc>
           <w:tcPr>
-            <w:tcW w:w="8745" w:type="dxa"/>
+            <w:tcW w:w="8744" w:type="dxa"/>
             <w:gridSpan w:val="2"/>
+            <w:tcBorders>
+              <w:top w:val="single" w:sz="18" w:space="0" w:color="233D81"/>
+              <w:left w:val="single" w:sz="18" w:space="0" w:color="233D81"/>
+              <w:bottom w:val="single" w:sz="18" w:space="0" w:color="233D81"/>
+              <w:right w:val="single" w:sz="18" w:space="0" w:color="233D81"/>
+            </w:tcBorders>
           </w:tcPr>
-          <w:p/>
+          <w:p>
+            <w:pPr>
+              <w:pStyle w:val="Normal"/>
+              <w:widowControl/>
+              <w:bidi w:val="0"/>
+              <w:spacing w:lineRule="auto" w:line="240" w:before="0" w:after="120"/>
+              <w:jc w:val="both"/>
+              <w:rPr/>
+            </w:pPr>
+            <w:r>
+              <w:rPr/>
+            </w:r>
+          </w:p>
         </w:tc>
       </w:tr>
       <w:tr>
+        <w:trPr/>
         <w:tc>
           <w:tcPr>
-            <w:tcW w:w="8745" w:type="dxa"/>
+            <w:tcW w:w="8744" w:type="dxa"/>
             <w:gridSpan w:val="2"/>
+            <w:tcBorders>
+              <w:top w:val="single" w:sz="18" w:space="0" w:color="233D81"/>
+              <w:left w:val="single" w:sz="18" w:space="0" w:color="233D81"/>
+              <w:bottom w:val="single" w:sz="18" w:space="0" w:color="233D81"/>
+              <w:right w:val="single" w:sz="18" w:space="0" w:color="233D81"/>
+            </w:tcBorders>
           </w:tcPr>
           <w:p>
             <w:pPr>
+              <w:pStyle w:val="Normal"/>
+              <w:spacing w:before="0" w:after="120"/>
               <w:rPr>
                 <w:color w:val="233D81"/>
               </w:rPr>
@@ -899,43 +888,68 @@
               <w:rPr>
                 <w:color w:val="233D81"/>
               </w:rPr>
-              <w:t xml:space="preserve"> najważniejszych osiągnięć dydaktycznych ze szczególnym uwzględnieniem ostatnich 6 lat, wraz z wskazaniem dat uzyskania (np. autorstwo podręczników/materiałów dydaktycznych, wdrożone innowacje dydaktyczne, nagrody uzyskane przez studentów, nad którymi nauczyciel akademicki sprawował opiekę naukową/artystyczną, opieka nad beneficjentem Diamentowego Grantu, uruchomienie nowego kierunku studiów/specjalności/ zajęć/grupy zajęć, opieka nad kołem naukowym, prowadzenie zajęć w języku obcym, w tym w</w:t>
-            </w:r>
-            <w:r>
-              <w:rPr>
-                <w:color w:val="233D81"/>
-              </w:rPr>
-              <w:t> </w:t>
-            </w:r>
-            <w:r>
-              <w:rPr>
-                <w:color w:val="233D81"/>
-              </w:rPr>
-              <w:t>uczelni zagranicznej, np. w ramach mobilności nauczycieli akademickich).</w:t>
+              <w:t xml:space="preserve"> najważniejszych osiągnięć dydaktycznych ze szczególnym uwzględnieniem ostatnich 6 lat, wraz z wskazaniem dat uzyskania (np. autorstwo podręczników/materiałów dydaktycznych, wdrożone innowacje dydaktyczne, nagrody uzyskane przez studentów, nad którymi nauczyciel akademicki sprawował opiekę naukową/artystyczną, opieka nad beneficjentem Diamentowego Grantu, uruchomienie nowego kierunku studiów/specjalności/ zajęć/grupy zajęć, opieka nad kołem naukowym, prowadzenie zajęć w języku obcym, w tym w uczelni zagranicznej, np. w ramach mobilności nauczycieli akademickich).</w:t>
             </w:r>
           </w:p>
         </w:tc>
       </w:tr>
       <w:tr>
         <w:trPr>
-          <w:trHeight w:val="509"/>
+          <w:trHeight w:val="509" w:hRule="atLeast"/>
         </w:trPr>
         <w:tc>
           <w:tcPr>
-            <w:tcW w:w="8745" w:type="dxa"/>
+            <w:tcW w:w="8744" w:type="dxa"/>
             <w:gridSpan w:val="2"/>
+            <w:tcBorders>
+              <w:top w:val="single" w:sz="18" w:space="0" w:color="233D81"/>
+              <w:left w:val="single" w:sz="18" w:space="0" w:color="233D81"/>
+              <w:bottom w:val="single" w:sz="18" w:space="0" w:color="233D81"/>
+              <w:right w:val="single" w:sz="18" w:space="0" w:color="233D81"/>
+            </w:tcBorders>
           </w:tcPr>
-          <w:p/>
+          <w:p>
+            <w:pPr>
+              <w:pStyle w:val="Domylnie"/>
+              <w:jc w:val="both"/>
+              <w:rPr/>
+            </w:pPr>
+            <w:r>
+              <w:rPr/>
+              <w:t xml:space="preserve">Wieloletnie członkostwo w </w:t>
+            </w:r>
+            <w:r>
+              <w:rPr/>
+              <w:t xml:space="preserve">Pomorskim </w:t>
+            </w:r>
+            <w:r>
+              <w:rPr/>
+              <w:t xml:space="preserve">Komitecie Olimpiady Matematycznej (co najmniej 10 lat) – </w:t>
+            </w:r>
+            <w:r>
+              <w:rPr/>
+              <w:t>sprawdzanie prac konkursowych. Prowadzenie na Uniwersytecie Gdańskim wielu wykładów w języku angielskim (kombinatoryka, teoria liczb (zastępstwo)).</w:t>
+            </w:r>
+          </w:p>
         </w:tc>
       </w:tr>
       <w:tr>
+        <w:trPr/>
         <w:tc>
           <w:tcPr>
-            <w:tcW w:w="8745" w:type="dxa"/>
+            <w:tcW w:w="8744" w:type="dxa"/>
             <w:gridSpan w:val="2"/>
+            <w:tcBorders>
+              <w:top w:val="single" w:sz="18" w:space="0" w:color="233D81"/>
+              <w:left w:val="single" w:sz="18" w:space="0" w:color="233D81"/>
+              <w:bottom w:val="single" w:sz="18" w:space="0" w:color="233D81"/>
+              <w:right w:val="single" w:sz="18" w:space="0" w:color="233D81"/>
+            </w:tcBorders>
           </w:tcPr>
           <w:p>
             <w:pPr>
+              <w:pStyle w:val="Normal"/>
+              <w:spacing w:before="0" w:after="120"/>
               <w:rPr>
                 <w:color w:val="233D81"/>
               </w:rPr>
@@ -951,34 +965,67 @@
       </w:tr>
       <w:tr>
         <w:trPr>
-          <w:trHeight w:val="509"/>
+          <w:trHeight w:val="509" w:hRule="atLeast"/>
         </w:trPr>
         <w:tc>
           <w:tcPr>
-            <w:tcW w:w="8745" w:type="dxa"/>
+            <w:tcW w:w="8744" w:type="dxa"/>
             <w:gridSpan w:val="2"/>
+            <w:tcBorders>
+              <w:top w:val="single" w:sz="18" w:space="0" w:color="233D81"/>
+              <w:left w:val="single" w:sz="18" w:space="0" w:color="233D81"/>
+              <w:bottom w:val="single" w:sz="18" w:space="0" w:color="233D81"/>
+              <w:right w:val="single" w:sz="18" w:space="0" w:color="233D81"/>
+            </w:tcBorders>
           </w:tcPr>
-          <w:p/>
+          <w:p>
+            <w:pPr>
+              <w:pStyle w:val="Normal"/>
+              <w:widowControl/>
+              <w:bidi w:val="0"/>
+              <w:spacing w:lineRule="auto" w:line="240" w:before="0" w:after="120"/>
+              <w:jc w:val="both"/>
+              <w:rPr/>
+            </w:pPr>
+            <w:r>
+              <w:rPr/>
+            </w:r>
+          </w:p>
         </w:tc>
       </w:tr>
     </w:tbl>
-    <w:p/>
+    <w:p>
+      <w:pPr>
+        <w:pStyle w:val="Normal"/>
+        <w:widowControl/>
+        <w:bidi w:val="0"/>
+        <w:spacing w:lineRule="auto" w:line="240" w:before="0" w:after="120"/>
+        <w:jc w:val="both"/>
+        <w:rPr/>
+      </w:pPr>
+      <w:r>
+        <w:rPr/>
+      </w:r>
+    </w:p>
     <w:sectPr>
+      <w:type w:val="nextPage"/>
       <w:pgSz w:w="11906" w:h="16838"/>
-      <w:pgMar w:top="1417" w:right="1417" w:bottom="1417" w:left="1417" w:header="708" w:footer="708" w:gutter="0"/>
-      <w:cols w:space="708"/>
-      <w:docGrid w:linePitch="360"/>
+      <w:pgMar w:left="1417" w:right="1417" w:gutter="0" w:header="0" w:top="1417" w:footer="0" w:bottom="1417"/>
+      <w:pgNumType w:fmt="decimal"/>
+      <w:formProt w:val="false"/>
+      <w:textDirection w:val="lrTb"/>
+      <w:docGrid w:type="default" w:linePitch="360" w:charSpace="0"/>
     </w:sectPr>
   </w:body>
 </w:document>
 </file>
 
 <file path=word/styles.xml><?xml version="1.0" encoding="utf-8"?>
-<w:styles xmlns:mc="http://schemas.openxmlformats.org/markup-compatibility/2006" xmlns:r="http://schemas.openxmlformats.org/officeDocument/2006/relationships" xmlns:w="http://schemas.openxmlformats.org/wordprocessingml/2006/main" xmlns:w14="http://schemas.microsoft.com/office/word/2010/wordml" xmlns:w15="http://schemas.microsoft.com/office/word/2012/wordml" xmlns:w16cex="http://schemas.microsoft.com/office/word/2018/wordml/cex" xmlns:w16cid="http://schemas.microsoft.com/office/word/2016/wordml/cid" xmlns:w16="http://schemas.microsoft.com/office/word/2018/wordml" xmlns:w16du="http://schemas.microsoft.com/office/word/2023/wordml/word16du" xmlns:w16sdtdh="http://schemas.microsoft.com/office/word/2020/wordml/sdtdatahash" xmlns:w16sdtfl="http://schemas.microsoft.com/office/word/2024/wordml/sdtformatlock" xmlns:w16se="http://schemas.microsoft.com/office/word/2015/wordml/symex" mc:Ignorable="w14 w15 w16se w16cid w16 w16cex w16sdtdh w16sdtfl w16du">
+<w:styles xmlns:w="http://schemas.openxmlformats.org/wordprocessingml/2006/main" xmlns:w14="http://schemas.microsoft.com/office/word/2010/wordml" xmlns:mc="http://schemas.openxmlformats.org/markup-compatibility/2006" mc:Ignorable="w14">
   <w:docDefaults>
     <w:rPrDefault>
       <w:rPr>
-        <w:rFonts w:asciiTheme="minorHAnsi" w:eastAsiaTheme="minorHAnsi" w:hAnsiTheme="minorHAnsi" w:cstheme="minorBidi"/>
+        <w:rFonts w:ascii="Aptos" w:hAnsi="Aptos" w:eastAsia="Aptos" w:cs="" w:asciiTheme="minorHAnsi" w:cstheme="minorBidi" w:eastAsiaTheme="minorHAnsi" w:hAnsiTheme="minorHAnsi"/>
         <w:kern w:val="2"/>
         <w:sz w:val="24"/>
         <w:szCs w:val="24"/>
@@ -988,21 +1035,21 @@
     </w:rPrDefault>
     <w:pPrDefault>
       <w:pPr>
-        <w:spacing w:after="160" w:line="278" w:lineRule="auto"/>
+        <w:suppressAutoHyphens w:val="true"/>
       </w:pPr>
     </w:pPrDefault>
   </w:docDefaults>
   <w:latentStyles w:defLockedState="0" w:defUIPriority="99" w:defSemiHidden="0" w:defUnhideWhenUsed="0" w:defQFormat="0" w:count="376">
     <w:lsdException w:name="Normal" w:uiPriority="0" w:qFormat="1"/>
     <w:lsdException w:name="heading 1" w:uiPriority="9" w:qFormat="1"/>
-    <w:lsdException w:name="heading 2" w:semiHidden="1" w:uiPriority="9" w:unhideWhenUsed="1" w:qFormat="1"/>
-    <w:lsdException w:name="heading 3" w:semiHidden="1" w:uiPriority="9" w:unhideWhenUsed="1" w:qFormat="1"/>
-    <w:lsdException w:name="heading 4" w:semiHidden="1" w:uiPriority="9" w:unhideWhenUsed="1" w:qFormat="1"/>
-    <w:lsdException w:name="heading 5" w:semiHidden="1" w:uiPriority="9" w:unhideWhenUsed="1" w:qFormat="1"/>
-    <w:lsdException w:name="heading 6" w:semiHidden="1" w:uiPriority="9" w:unhideWhenUsed="1" w:qFormat="1"/>
-    <w:lsdException w:name="heading 7" w:semiHidden="1" w:uiPriority="9" w:unhideWhenUsed="1" w:qFormat="1"/>
-    <w:lsdException w:name="heading 8" w:semiHidden="1" w:uiPriority="9" w:unhideWhenUsed="1" w:qFormat="1"/>
-    <w:lsdException w:name="heading 9" w:semiHidden="1" w:uiPriority="9" w:unhideWhenUsed="1" w:qFormat="1"/>
+    <w:lsdException w:name="heading 2" w:uiPriority="9" w:semiHidden="1" w:unhideWhenUsed="1" w:qFormat="1"/>
+    <w:lsdException w:name="heading 3" w:uiPriority="9" w:semiHidden="1" w:unhideWhenUsed="1" w:qFormat="1"/>
+    <w:lsdException w:name="heading 4" w:uiPriority="9" w:semiHidden="1" w:unhideWhenUsed="1" w:qFormat="1"/>
+    <w:lsdException w:name="heading 5" w:uiPriority="9" w:semiHidden="1" w:unhideWhenUsed="1" w:qFormat="1"/>
+    <w:lsdException w:name="heading 6" w:uiPriority="9" w:semiHidden="1" w:unhideWhenUsed="1" w:qFormat="1"/>
+    <w:lsdException w:name="heading 7" w:uiPriority="9" w:semiHidden="1" w:unhideWhenUsed="1" w:qFormat="1"/>
+    <w:lsdException w:name="heading 8" w:uiPriority="9" w:semiHidden="1" w:unhideWhenUsed="1" w:qFormat="1"/>
+    <w:lsdException w:name="heading 9" w:uiPriority="9" w:semiHidden="1" w:unhideWhenUsed="1" w:qFormat="1"/>
     <w:lsdException w:name="index 1" w:semiHidden="1" w:unhideWhenUsed="1"/>
     <w:lsdException w:name="index 2" w:semiHidden="1" w:unhideWhenUsed="1"/>
     <w:lsdException w:name="index 3" w:semiHidden="1" w:unhideWhenUsed="1"/>
@@ -1012,22 +1059,22 @@
     <w:lsdException w:name="index 7" w:semiHidden="1" w:unhideWhenUsed="1"/>
     <w:lsdException w:name="index 8" w:semiHidden="1" w:unhideWhenUsed="1"/>
     <w:lsdException w:name="index 9" w:semiHidden="1" w:unhideWhenUsed="1"/>
-    <w:lsdException w:name="toc 1" w:semiHidden="1" w:uiPriority="39" w:unhideWhenUsed="1"/>
-    <w:lsdException w:name="toc 2" w:semiHidden="1" w:uiPriority="39" w:unhideWhenUsed="1"/>
-    <w:lsdException w:name="toc 3" w:semiHidden="1" w:uiPriority="39" w:unhideWhenUsed="1"/>
-    <w:lsdException w:name="toc 4" w:semiHidden="1" w:uiPriority="39" w:unhideWhenUsed="1"/>
-    <w:lsdException w:name="toc 5" w:semiHidden="1" w:uiPriority="39" w:unhideWhenUsed="1"/>
-    <w:lsdException w:name="toc 6" w:semiHidden="1" w:uiPriority="39" w:unhideWhenUsed="1"/>
-    <w:lsdException w:name="toc 7" w:semiHidden="1" w:uiPriority="39" w:unhideWhenUsed="1"/>
-    <w:lsdException w:name="toc 8" w:semiHidden="1" w:uiPriority="39" w:unhideWhenUsed="1"/>
-    <w:lsdException w:name="toc 9" w:semiHidden="1" w:uiPriority="39" w:unhideWhenUsed="1"/>
+    <w:lsdException w:name="toc 1" w:uiPriority="39" w:semiHidden="1" w:unhideWhenUsed="1"/>
+    <w:lsdException w:name="toc 2" w:uiPriority="39" w:semiHidden="1" w:unhideWhenUsed="1"/>
+    <w:lsdException w:name="toc 3" w:uiPriority="39" w:semiHidden="1" w:unhideWhenUsed="1"/>
+    <w:lsdException w:name="toc 4" w:uiPriority="39" w:semiHidden="1" w:unhideWhenUsed="1"/>
+    <w:lsdException w:name="toc 5" w:uiPriority="39" w:semiHidden="1" w:unhideWhenUsed="1"/>
+    <w:lsdException w:name="toc 6" w:uiPriority="39" w:semiHidden="1" w:unhideWhenUsed="1"/>
+    <w:lsdException w:name="toc 7" w:uiPriority="39" w:semiHidden="1" w:unhideWhenUsed="1"/>
+    <w:lsdException w:name="toc 8" w:uiPriority="39" w:semiHidden="1" w:unhideWhenUsed="1"/>
+    <w:lsdException w:name="toc 9" w:uiPriority="39" w:semiHidden="1" w:unhideWhenUsed="1"/>
     <w:lsdException w:name="Normal Indent" w:semiHidden="1" w:unhideWhenUsed="1"/>
     <w:lsdException w:name="footnote text" w:semiHidden="1" w:unhideWhenUsed="1"/>
     <w:lsdException w:name="annotation text" w:semiHidden="1" w:unhideWhenUsed="1"/>
     <w:lsdException w:name="header" w:semiHidden="1" w:unhideWhenUsed="1"/>
     <w:lsdException w:name="footer" w:semiHidden="1" w:unhideWhenUsed="1"/>
     <w:lsdException w:name="index heading" w:semiHidden="1" w:unhideWhenUsed="1"/>
-    <w:lsdException w:name="caption" w:semiHidden="1" w:uiPriority="35" w:unhideWhenUsed="1" w:qFormat="1"/>
+    <w:lsdException w:name="caption" w:uiPriority="35" w:semiHidden="1" w:unhideWhenUsed="1" w:qFormat="1"/>
     <w:lsdException w:name="table of figures" w:semiHidden="1" w:unhideWhenUsed="1"/>
     <w:lsdException w:name="envelope address" w:semiHidden="1" w:unhideWhenUsed="1"/>
     <w:lsdException w:name="envelope return" w:semiHidden="1" w:unhideWhenUsed="1"/>
@@ -1058,7 +1105,7 @@
     <w:lsdException w:name="Title" w:uiPriority="10" w:qFormat="1"/>
     <w:lsdException w:name="Closing" w:semiHidden="1" w:unhideWhenUsed="1"/>
     <w:lsdException w:name="Signature" w:semiHidden="1" w:unhideWhenUsed="1"/>
-    <w:lsdException w:name="Default Paragraph Font" w:semiHidden="1" w:uiPriority="1" w:unhideWhenUsed="1"/>
+    <w:lsdException w:name="Default Paragraph Font" w:uiPriority="1" w:semiHidden="1" w:unhideWhenUsed="1"/>
     <w:lsdException w:name="Body Text" w:semiHidden="1" w:unhideWhenUsed="1"/>
     <w:lsdException w:name="Body Text Indent" w:semiHidden="1" w:unhideWhenUsed="1"/>
     <w:lsdException w:name="List Continue" w:semiHidden="1" w:unhideWhenUsed="1"/>
@@ -1258,8 +1305,8 @@
     <w:lsdException w:name="Subtle Reference" w:uiPriority="31" w:qFormat="1"/>
     <w:lsdException w:name="Intense Reference" w:uiPriority="32" w:qFormat="1"/>
     <w:lsdException w:name="Book Title" w:uiPriority="33" w:qFormat="1"/>
-    <w:lsdException w:name="Bibliography" w:semiHidden="1" w:uiPriority="37" w:unhideWhenUsed="1"/>
-    <w:lsdException w:name="TOC Heading" w:semiHidden="1" w:uiPriority="39" w:unhideWhenUsed="1" w:qFormat="1"/>
+    <w:lsdException w:name="Bibliography" w:uiPriority="37" w:semiHidden="1" w:unhideWhenUsed="1"/>
+    <w:lsdException w:name="TOC Heading" w:uiPriority="39" w:semiHidden="1" w:unhideWhenUsed="1" w:qFormat="1"/>
     <w:lsdException w:name="Plain Table 1" w:uiPriority="41"/>
     <w:lsdException w:name="Plain Table 2" w:uiPriority="42"/>
     <w:lsdException w:name="Plain Table 3" w:uiPriority="43"/>
@@ -1370,225 +1417,608 @@
     <w:lsdException w:name="Unresolved Mention" w:semiHidden="1" w:unhideWhenUsed="1"/>
     <w:lsdException w:name="Smart Link" w:semiHidden="1" w:unhideWhenUsed="1"/>
   </w:latentStyles>
-  <w:style w:type="paragraph" w:default="1" w:styleId="Normalny">
+  <w:style w:type="paragraph" w:styleId="Normal" w:default="1">
     <w:name w:val="Normal"/>
     <w:qFormat/>
-    <w:rsid w:val="007F4E6D"/>
+    <w:rsid w:val="007f4e6d"/>
     <w:pPr>
-      <w:spacing w:after="120" w:line="240" w:lineRule="auto"/>
+      <w:widowControl/>
+      <w:bidi w:val="0"/>
+      <w:spacing w:lineRule="auto" w:line="240" w:before="0" w:after="120"/>
       <w:jc w:val="both"/>
     </w:pPr>
     <w:rPr>
-      <w:rFonts w:ascii="Calibri" w:eastAsia="Times New Roman" w:hAnsi="Calibri" w:cs="Times New Roman"/>
+      <w:rFonts w:ascii="Calibri" w:hAnsi="Calibri" w:eastAsia="Times New Roman" w:cs="Times New Roman"/>
+      <w:color w:val="auto"/>
       <w:kern w:val="0"/>
       <w:sz w:val="22"/>
-      <w:lang w:eastAsia="pl-PL"/>
+      <w:szCs w:val="24"/>
+      <w:lang w:eastAsia="pl-PL" w:val="pl-PL" w:bidi="ar-SA"/>
       <w14:ligatures w14:val="none"/>
     </w:rPr>
   </w:style>
-  <w:style w:type="paragraph" w:styleId="Nagwek1">
-    <w:name w:val="heading 1"/>
-    <w:basedOn w:val="Normalny"/>
-    <w:next w:val="Normalny"/>
+  <w:style w:type="paragraph" w:styleId="Heading1">
+    <w:name w:val="Heading 1"/>
+    <w:basedOn w:val="Normal"/>
+    <w:next w:val="Normal"/>
     <w:link w:val="Nagwek1Znak"/>
     <w:uiPriority w:val="9"/>
     <w:qFormat/>
-    <w:rsid w:val="000C1256"/>
+    <w:rsid w:val="000c1256"/>
     <w:pPr>
-      <w:keepNext/>
+      <w:keepNext w:val="true"/>
       <w:keepLines/>
       <w:spacing w:before="360" w:after="80"/>
       <w:outlineLvl w:val="0"/>
     </w:pPr>
     <w:rPr>
-      <w:rFonts w:asciiTheme="majorHAnsi" w:eastAsiaTheme="majorEastAsia" w:hAnsiTheme="majorHAnsi" w:cstheme="majorBidi"/>
-      <w:color w:val="0F4761" w:themeColor="accent1" w:themeShade="BF"/>
+      <w:rFonts w:ascii="Aptos Display" w:hAnsi="Aptos Display" w:eastAsia="" w:cs="" w:asciiTheme="majorHAnsi" w:cstheme="majorBidi" w:eastAsiaTheme="majorEastAsia" w:hAnsiTheme="majorHAnsi"/>
+      <w:color w:themeColor="accent1" w:themeShade="bf" w:val="0F4761"/>
       <w:sz w:val="40"/>
       <w:szCs w:val="40"/>
     </w:rPr>
   </w:style>
-  <w:style w:type="paragraph" w:styleId="Nagwek2">
-    <w:name w:val="heading 2"/>
-    <w:basedOn w:val="Normalny"/>
-    <w:next w:val="Normalny"/>
+  <w:style w:type="paragraph" w:styleId="Heading2">
+    <w:name w:val="Heading 2"/>
+    <w:basedOn w:val="Normal"/>
+    <w:next w:val="Normal"/>
     <w:link w:val="Nagwek2Znak"/>
     <w:uiPriority w:val="9"/>
     <w:semiHidden/>
     <w:unhideWhenUsed/>
     <w:qFormat/>
-    <w:rsid w:val="000C1256"/>
+    <w:rsid w:val="000c1256"/>
     <w:pPr>
-      <w:keepNext/>
+      <w:keepNext w:val="true"/>
       <w:keepLines/>
       <w:spacing w:before="160" w:after="80"/>
       <w:outlineLvl w:val="1"/>
     </w:pPr>
     <w:rPr>
-      <w:rFonts w:asciiTheme="majorHAnsi" w:eastAsiaTheme="majorEastAsia" w:hAnsiTheme="majorHAnsi" w:cstheme="majorBidi"/>
-      <w:color w:val="0F4761" w:themeColor="accent1" w:themeShade="BF"/>
+      <w:rFonts w:ascii="Aptos Display" w:hAnsi="Aptos Display" w:eastAsia="" w:cs="" w:asciiTheme="majorHAnsi" w:cstheme="majorBidi" w:eastAsiaTheme="majorEastAsia" w:hAnsiTheme="majorHAnsi"/>
+      <w:color w:themeColor="accent1" w:themeShade="bf" w:val="0F4761"/>
       <w:sz w:val="32"/>
       <w:szCs w:val="32"/>
     </w:rPr>
   </w:style>
-  <w:style w:type="paragraph" w:styleId="Nagwek3">
-    <w:name w:val="heading 3"/>
-    <w:basedOn w:val="Normalny"/>
-    <w:next w:val="Normalny"/>
+  <w:style w:type="paragraph" w:styleId="Heading3">
+    <w:name w:val="Heading 3"/>
+    <w:basedOn w:val="Normal"/>
+    <w:next w:val="Normal"/>
     <w:link w:val="Nagwek3Znak"/>
     <w:uiPriority w:val="9"/>
     <w:semiHidden/>
     <w:unhideWhenUsed/>
     <w:qFormat/>
-    <w:rsid w:val="000C1256"/>
+    <w:rsid w:val="000c1256"/>
     <w:pPr>
-      <w:keepNext/>
+      <w:keepNext w:val="true"/>
       <w:keepLines/>
       <w:spacing w:before="160" w:after="80"/>
       <w:outlineLvl w:val="2"/>
     </w:pPr>
     <w:rPr>
-      <w:rFonts w:eastAsiaTheme="majorEastAsia" w:cstheme="majorBidi"/>
-      <w:color w:val="0F4761" w:themeColor="accent1" w:themeShade="BF"/>
+      <w:rFonts w:eastAsia="" w:cs="" w:cstheme="majorBidi" w:eastAsiaTheme="majorEastAsia"/>
+      <w:color w:themeColor="accent1" w:themeShade="bf" w:val="0F4761"/>
       <w:sz w:val="28"/>
       <w:szCs w:val="28"/>
     </w:rPr>
   </w:style>
-  <w:style w:type="paragraph" w:styleId="Nagwek4">
-    <w:name w:val="heading 4"/>
-    <w:basedOn w:val="Normalny"/>
-    <w:next w:val="Normalny"/>
+  <w:style w:type="paragraph" w:styleId="Heading4">
+    <w:name w:val="Heading 4"/>
+    <w:basedOn w:val="Normal"/>
+    <w:next w:val="Normal"/>
     <w:link w:val="Nagwek4Znak"/>
     <w:uiPriority w:val="9"/>
     <w:semiHidden/>
     <w:unhideWhenUsed/>
     <w:qFormat/>
-    <w:rsid w:val="000C1256"/>
+    <w:rsid w:val="000c1256"/>
     <w:pPr>
-      <w:keepNext/>
+      <w:keepNext w:val="true"/>
       <w:keepLines/>
       <w:spacing w:before="80" w:after="40"/>
       <w:outlineLvl w:val="3"/>
     </w:pPr>
     <w:rPr>
-      <w:rFonts w:eastAsiaTheme="majorEastAsia" w:cstheme="majorBidi"/>
+      <w:rFonts w:eastAsia="" w:cs="" w:cstheme="majorBidi" w:eastAsiaTheme="majorEastAsia"/>
       <w:i/>
       <w:iCs/>
-      <w:color w:val="0F4761" w:themeColor="accent1" w:themeShade="BF"/>
-    </w:rPr>
-  </w:style>
-  <w:style w:type="paragraph" w:styleId="Nagwek5">
-    <w:name w:val="heading 5"/>
-    <w:basedOn w:val="Normalny"/>
-    <w:next w:val="Normalny"/>
+      <w:color w:themeColor="accent1" w:themeShade="bf" w:val="0F4761"/>
+    </w:rPr>
+  </w:style>
+  <w:style w:type="paragraph" w:styleId="Heading5">
+    <w:name w:val="Heading 5"/>
+    <w:basedOn w:val="Normal"/>
+    <w:next w:val="Normal"/>
     <w:link w:val="Nagwek5Znak"/>
     <w:uiPriority w:val="9"/>
     <w:semiHidden/>
     <w:unhideWhenUsed/>
     <w:qFormat/>
-    <w:rsid w:val="000C1256"/>
+    <w:rsid w:val="000c1256"/>
     <w:pPr>
-      <w:keepNext/>
+      <w:keepNext w:val="true"/>
       <w:keepLines/>
       <w:spacing w:before="80" w:after="40"/>
       <w:outlineLvl w:val="4"/>
     </w:pPr>
     <w:rPr>
-      <w:rFonts w:eastAsiaTheme="majorEastAsia" w:cstheme="majorBidi"/>
-      <w:color w:val="0F4761" w:themeColor="accent1" w:themeShade="BF"/>
-    </w:rPr>
-  </w:style>
-  <w:style w:type="paragraph" w:styleId="Nagwek6">
-    <w:name w:val="heading 6"/>
-    <w:basedOn w:val="Normalny"/>
-    <w:next w:val="Normalny"/>
+      <w:rFonts w:eastAsia="" w:cs="" w:cstheme="majorBidi" w:eastAsiaTheme="majorEastAsia"/>
+      <w:color w:themeColor="accent1" w:themeShade="bf" w:val="0F4761"/>
+    </w:rPr>
+  </w:style>
+  <w:style w:type="paragraph" w:styleId="Heading6">
+    <w:name w:val="Heading 6"/>
+    <w:basedOn w:val="Normal"/>
+    <w:next w:val="Normal"/>
     <w:link w:val="Nagwek6Znak"/>
     <w:uiPriority w:val="9"/>
     <w:semiHidden/>
     <w:unhideWhenUsed/>
     <w:qFormat/>
-    <w:rsid w:val="000C1256"/>
+    <w:rsid w:val="000c1256"/>
     <w:pPr>
-      <w:keepNext/>
+      <w:keepNext w:val="true"/>
       <w:keepLines/>
       <w:spacing w:before="40" w:after="0"/>
       <w:outlineLvl w:val="5"/>
     </w:pPr>
     <w:rPr>
-      <w:rFonts w:eastAsiaTheme="majorEastAsia" w:cstheme="majorBidi"/>
+      <w:rFonts w:eastAsia="" w:cs="" w:cstheme="majorBidi" w:eastAsiaTheme="majorEastAsia"/>
       <w:i/>
       <w:iCs/>
-      <w:color w:val="595959" w:themeColor="text1" w:themeTint="A6"/>
-    </w:rPr>
-  </w:style>
-  <w:style w:type="paragraph" w:styleId="Nagwek7">
-    <w:name w:val="heading 7"/>
-    <w:basedOn w:val="Normalny"/>
-    <w:next w:val="Normalny"/>
+      <w:color w:themeColor="text1" w:themeTint="a6" w:val="595959"/>
+    </w:rPr>
+  </w:style>
+  <w:style w:type="paragraph" w:styleId="Heading7">
+    <w:name w:val="Heading 7"/>
+    <w:basedOn w:val="Normal"/>
+    <w:next w:val="Normal"/>
     <w:link w:val="Nagwek7Znak"/>
     <w:uiPriority w:val="9"/>
     <w:semiHidden/>
     <w:unhideWhenUsed/>
     <w:qFormat/>
-    <w:rsid w:val="000C1256"/>
+    <w:rsid w:val="000c1256"/>
     <w:pPr>
-      <w:keepNext/>
+      <w:keepNext w:val="true"/>
       <w:keepLines/>
       <w:spacing w:before="40" w:after="0"/>
       <w:outlineLvl w:val="6"/>
     </w:pPr>
     <w:rPr>
-      <w:rFonts w:eastAsiaTheme="majorEastAsia" w:cstheme="majorBidi"/>
-      <w:color w:val="595959" w:themeColor="text1" w:themeTint="A6"/>
-    </w:rPr>
-  </w:style>
-  <w:style w:type="paragraph" w:styleId="Nagwek8">
-    <w:name w:val="heading 8"/>
-    <w:basedOn w:val="Normalny"/>
-    <w:next w:val="Normalny"/>
+      <w:rFonts w:eastAsia="" w:cs="" w:cstheme="majorBidi" w:eastAsiaTheme="majorEastAsia"/>
+      <w:color w:themeColor="text1" w:themeTint="a6" w:val="595959"/>
+    </w:rPr>
+  </w:style>
+  <w:style w:type="paragraph" w:styleId="Heading8">
+    <w:name w:val="Heading 8"/>
+    <w:basedOn w:val="Normal"/>
+    <w:next w:val="Normal"/>
     <w:link w:val="Nagwek8Znak"/>
     <w:uiPriority w:val="9"/>
     <w:semiHidden/>
     <w:unhideWhenUsed/>
     <w:qFormat/>
-    <w:rsid w:val="000C1256"/>
+    <w:rsid w:val="000c1256"/>
     <w:pPr>
-      <w:keepNext/>
+      <w:keepNext w:val="true"/>
       <w:keepLines/>
-      <w:spacing w:after="0"/>
+      <w:spacing w:before="0" w:after="0"/>
       <w:outlineLvl w:val="7"/>
     </w:pPr>
     <w:rPr>
-      <w:rFonts w:eastAsiaTheme="majorEastAsia" w:cstheme="majorBidi"/>
+      <w:rFonts w:eastAsia="" w:cs="" w:cstheme="majorBidi" w:eastAsiaTheme="majorEastAsia"/>
       <w:i/>
       <w:iCs/>
-      <w:color w:val="272727" w:themeColor="text1" w:themeTint="D8"/>
-    </w:rPr>
-  </w:style>
-  <w:style w:type="paragraph" w:styleId="Nagwek9">
-    <w:name w:val="heading 9"/>
-    <w:basedOn w:val="Normalny"/>
-    <w:next w:val="Normalny"/>
+      <w:color w:themeColor="text1" w:themeTint="d8" w:val="272727"/>
+    </w:rPr>
+  </w:style>
+  <w:style w:type="paragraph" w:styleId="Heading9">
+    <w:name w:val="Heading 9"/>
+    <w:basedOn w:val="Normal"/>
+    <w:next w:val="Normal"/>
     <w:link w:val="Nagwek9Znak"/>
     <w:uiPriority w:val="9"/>
     <w:semiHidden/>
     <w:unhideWhenUsed/>
     <w:qFormat/>
-    <w:rsid w:val="000C1256"/>
+    <w:rsid w:val="000c1256"/>
     <w:pPr>
-      <w:keepNext/>
+      <w:keepNext w:val="true"/>
       <w:keepLines/>
-      <w:spacing w:after="0"/>
+      <w:spacing w:before="0" w:after="0"/>
       <w:outlineLvl w:val="8"/>
     </w:pPr>
     <w:rPr>
-      <w:rFonts w:eastAsiaTheme="majorEastAsia" w:cstheme="majorBidi"/>
-      <w:color w:val="272727" w:themeColor="text1" w:themeTint="D8"/>
-    </w:rPr>
-  </w:style>
-  <w:style w:type="character" w:default="1" w:styleId="Domylnaczcionkaakapitu">
+      <w:rFonts w:eastAsia="" w:cs="" w:cstheme="majorBidi" w:eastAsiaTheme="majorEastAsia"/>
+      <w:color w:themeColor="text1" w:themeTint="d8" w:val="272727"/>
+    </w:rPr>
+  </w:style>
+  <w:style w:type="character" w:styleId="DefaultParagraphFont" w:default="1">
     <w:name w:val="Default Paragraph Font"/>
     <w:uiPriority w:val="1"/>
     <w:unhideWhenUsed/>
+    <w:qFormat/>
+    <w:rPr/>
+  </w:style>
+  <w:style w:type="character" w:styleId="Nagwek1Znak" w:customStyle="1">
+    <w:name w:val="Nagłówek 1 Znak"/>
+    <w:basedOn w:val="DefaultParagraphFont"/>
+    <w:uiPriority w:val="9"/>
+    <w:qFormat/>
+    <w:rsid w:val="000c1256"/>
+    <w:rPr>
+      <w:rFonts w:ascii="Aptos Display" w:hAnsi="Aptos Display" w:eastAsia="" w:cs="" w:asciiTheme="majorHAnsi" w:cstheme="majorBidi" w:eastAsiaTheme="majorEastAsia" w:hAnsiTheme="majorHAnsi"/>
+      <w:color w:themeColor="accent1" w:themeShade="bf" w:val="0F4761"/>
+      <w:sz w:val="40"/>
+      <w:szCs w:val="40"/>
+    </w:rPr>
+  </w:style>
+  <w:style w:type="character" w:styleId="Nagwek2Znak" w:customStyle="1">
+    <w:name w:val="Nagłówek 2 Znak"/>
+    <w:basedOn w:val="DefaultParagraphFont"/>
+    <w:uiPriority w:val="9"/>
+    <w:semiHidden/>
+    <w:qFormat/>
+    <w:rsid w:val="000c1256"/>
+    <w:rPr>
+      <w:rFonts w:ascii="Aptos Display" w:hAnsi="Aptos Display" w:eastAsia="" w:cs="" w:asciiTheme="majorHAnsi" w:cstheme="majorBidi" w:eastAsiaTheme="majorEastAsia" w:hAnsiTheme="majorHAnsi"/>
+      <w:color w:themeColor="accent1" w:themeShade="bf" w:val="0F4761"/>
+      <w:sz w:val="32"/>
+      <w:szCs w:val="32"/>
+    </w:rPr>
+  </w:style>
+  <w:style w:type="character" w:styleId="Nagwek3Znak" w:customStyle="1">
+    <w:name w:val="Nagłówek 3 Znak"/>
+    <w:basedOn w:val="DefaultParagraphFont"/>
+    <w:uiPriority w:val="9"/>
+    <w:semiHidden/>
+    <w:qFormat/>
+    <w:rsid w:val="000c1256"/>
+    <w:rPr>
+      <w:rFonts w:eastAsia="" w:cs="" w:cstheme="majorBidi" w:eastAsiaTheme="majorEastAsia"/>
+      <w:color w:themeColor="accent1" w:themeShade="bf" w:val="0F4761"/>
+      <w:sz w:val="28"/>
+      <w:szCs w:val="28"/>
+    </w:rPr>
+  </w:style>
+  <w:style w:type="character" w:styleId="Nagwek4Znak" w:customStyle="1">
+    <w:name w:val="Nagłówek 4 Znak"/>
+    <w:basedOn w:val="DefaultParagraphFont"/>
+    <w:uiPriority w:val="9"/>
+    <w:semiHidden/>
+    <w:qFormat/>
+    <w:rsid w:val="000c1256"/>
+    <w:rPr>
+      <w:rFonts w:eastAsia="" w:cs="" w:cstheme="majorBidi" w:eastAsiaTheme="majorEastAsia"/>
+      <w:i/>
+      <w:iCs/>
+      <w:color w:themeColor="accent1" w:themeShade="bf" w:val="0F4761"/>
+    </w:rPr>
+  </w:style>
+  <w:style w:type="character" w:styleId="Nagwek5Znak" w:customStyle="1">
+    <w:name w:val="Nagłówek 5 Znak"/>
+    <w:basedOn w:val="DefaultParagraphFont"/>
+    <w:uiPriority w:val="9"/>
+    <w:semiHidden/>
+    <w:qFormat/>
+    <w:rsid w:val="000c1256"/>
+    <w:rPr>
+      <w:rFonts w:eastAsia="" w:cs="" w:cstheme="majorBidi" w:eastAsiaTheme="majorEastAsia"/>
+      <w:color w:themeColor="accent1" w:themeShade="bf" w:val="0F4761"/>
+    </w:rPr>
+  </w:style>
+  <w:style w:type="character" w:styleId="Nagwek6Znak" w:customStyle="1">
+    <w:name w:val="Nagłówek 6 Znak"/>
+    <w:basedOn w:val="DefaultParagraphFont"/>
+    <w:uiPriority w:val="9"/>
+    <w:semiHidden/>
+    <w:qFormat/>
+    <w:rsid w:val="000c1256"/>
+    <w:rPr>
+      <w:rFonts w:eastAsia="" w:cs="" w:cstheme="majorBidi" w:eastAsiaTheme="majorEastAsia"/>
+      <w:i/>
+      <w:iCs/>
+      <w:color w:themeColor="text1" w:themeTint="a6" w:val="595959"/>
+    </w:rPr>
+  </w:style>
+  <w:style w:type="character" w:styleId="Nagwek7Znak" w:customStyle="1">
+    <w:name w:val="Nagłówek 7 Znak"/>
+    <w:basedOn w:val="DefaultParagraphFont"/>
+    <w:uiPriority w:val="9"/>
+    <w:semiHidden/>
+    <w:qFormat/>
+    <w:rsid w:val="000c1256"/>
+    <w:rPr>
+      <w:rFonts w:eastAsia="" w:cs="" w:cstheme="majorBidi" w:eastAsiaTheme="majorEastAsia"/>
+      <w:color w:themeColor="text1" w:themeTint="a6" w:val="595959"/>
+    </w:rPr>
+  </w:style>
+  <w:style w:type="character" w:styleId="Nagwek8Znak" w:customStyle="1">
+    <w:name w:val="Nagłówek 8 Znak"/>
+    <w:basedOn w:val="DefaultParagraphFont"/>
+    <w:uiPriority w:val="9"/>
+    <w:semiHidden/>
+    <w:qFormat/>
+    <w:rsid w:val="000c1256"/>
+    <w:rPr>
+      <w:rFonts w:eastAsia="" w:cs="" w:cstheme="majorBidi" w:eastAsiaTheme="majorEastAsia"/>
+      <w:i/>
+      <w:iCs/>
+      <w:color w:themeColor="text1" w:themeTint="d8" w:val="272727"/>
+    </w:rPr>
+  </w:style>
+  <w:style w:type="character" w:styleId="Nagwek9Znak" w:customStyle="1">
+    <w:name w:val="Nagłówek 9 Znak"/>
+    <w:basedOn w:val="DefaultParagraphFont"/>
+    <w:uiPriority w:val="9"/>
+    <w:semiHidden/>
+    <w:qFormat/>
+    <w:rsid w:val="000c1256"/>
+    <w:rPr>
+      <w:rFonts w:eastAsia="" w:cs="" w:cstheme="majorBidi" w:eastAsiaTheme="majorEastAsia"/>
+      <w:color w:themeColor="text1" w:themeTint="d8" w:val="272727"/>
+    </w:rPr>
+  </w:style>
+  <w:style w:type="character" w:styleId="TytuZnak" w:customStyle="1">
+    <w:name w:val="Tytuł Znak"/>
+    <w:basedOn w:val="DefaultParagraphFont"/>
+    <w:uiPriority w:val="10"/>
+    <w:qFormat/>
+    <w:rsid w:val="000c1256"/>
+    <w:rPr>
+      <w:rFonts w:ascii="Aptos Display" w:hAnsi="Aptos Display" w:eastAsia="" w:cs="" w:asciiTheme="majorHAnsi" w:cstheme="majorBidi" w:eastAsiaTheme="majorEastAsia" w:hAnsiTheme="majorHAnsi"/>
+      <w:spacing w:val="-10"/>
+      <w:kern w:val="2"/>
+      <w:sz w:val="56"/>
+      <w:szCs w:val="56"/>
+    </w:rPr>
+  </w:style>
+  <w:style w:type="character" w:styleId="PodtytuZnak" w:customStyle="1">
+    <w:name w:val="Podtytuł Znak"/>
+    <w:basedOn w:val="DefaultParagraphFont"/>
+    <w:uiPriority w:val="11"/>
+    <w:qFormat/>
+    <w:rsid w:val="000c1256"/>
+    <w:rPr>
+      <w:rFonts w:eastAsia="" w:cs="" w:cstheme="majorBidi" w:eastAsiaTheme="majorEastAsia"/>
+      <w:color w:themeColor="text1" w:themeTint="a6" w:val="595959"/>
+      <w:spacing w:val="15"/>
+      <w:sz w:val="28"/>
+      <w:szCs w:val="28"/>
+    </w:rPr>
+  </w:style>
+  <w:style w:type="character" w:styleId="CytatZnak" w:customStyle="1">
+    <w:name w:val="Cytat Znak"/>
+    <w:basedOn w:val="DefaultParagraphFont"/>
+    <w:link w:val="Quote"/>
+    <w:uiPriority w:val="29"/>
+    <w:qFormat/>
+    <w:rsid w:val="000c1256"/>
+    <w:rPr>
+      <w:i/>
+      <w:iCs/>
+      <w:color w:themeColor="text1" w:themeTint="bf" w:val="404040"/>
+    </w:rPr>
+  </w:style>
+  <w:style w:type="character" w:styleId="IntenseEmphasis">
+    <w:name w:val="Intense Emphasis"/>
+    <w:basedOn w:val="DefaultParagraphFont"/>
+    <w:uiPriority w:val="21"/>
+    <w:qFormat/>
+    <w:rsid w:val="000c1256"/>
+    <w:rPr>
+      <w:i/>
+      <w:iCs/>
+      <w:color w:themeColor="accent1" w:themeShade="bf" w:val="0F4761"/>
+    </w:rPr>
+  </w:style>
+  <w:style w:type="character" w:styleId="CytatintensywnyZnak" w:customStyle="1">
+    <w:name w:val="Cytat intensywny Znak"/>
+    <w:basedOn w:val="DefaultParagraphFont"/>
+    <w:link w:val="IntenseQuote"/>
+    <w:uiPriority w:val="30"/>
+    <w:qFormat/>
+    <w:rsid w:val="000c1256"/>
+    <w:rPr>
+      <w:i/>
+      <w:iCs/>
+      <w:color w:themeColor="accent1" w:themeShade="bf" w:val="0F4761"/>
+    </w:rPr>
+  </w:style>
+  <w:style w:type="character" w:styleId="IntenseReference">
+    <w:name w:val="Intense Reference"/>
+    <w:basedOn w:val="DefaultParagraphFont"/>
+    <w:uiPriority w:val="32"/>
+    <w:qFormat/>
+    <w:rsid w:val="000c1256"/>
+    <w:rPr>
+      <w:b/>
+      <w:bCs/>
+      <w:smallCaps/>
+      <w:color w:themeColor="accent1" w:themeShade="bf" w:val="0F4761"/>
+      <w:spacing w:val="5"/>
+    </w:rPr>
+  </w:style>
+  <w:style w:type="paragraph" w:styleId="Nagwek">
+    <w:name w:val="Nagłówek"/>
+    <w:basedOn w:val="Normal"/>
+    <w:next w:val="BodyText"/>
+    <w:qFormat/>
+    <w:pPr>
+      <w:keepNext w:val="true"/>
+      <w:spacing w:before="240" w:after="120"/>
+    </w:pPr>
+    <w:rPr>
+      <w:rFonts w:ascii="Liberation Sans" w:hAnsi="Liberation Sans" w:eastAsia="Noto Sans CJK SC" w:cs="FreeSans"/>
+      <w:sz w:val="28"/>
+      <w:szCs w:val="28"/>
+    </w:rPr>
+  </w:style>
+  <w:style w:type="paragraph" w:styleId="BodyText">
+    <w:name w:val="Body Text"/>
+    <w:basedOn w:val="Normal"/>
+    <w:pPr>
+      <w:spacing w:lineRule="auto" w:line="276" w:before="0" w:after="140"/>
+    </w:pPr>
+    <w:rPr/>
+  </w:style>
+  <w:style w:type="paragraph" w:styleId="List">
+    <w:name w:val="List"/>
+    <w:basedOn w:val="BodyText"/>
+    <w:pPr/>
+    <w:rPr>
+      <w:rFonts w:cs="FreeSans"/>
+    </w:rPr>
+  </w:style>
+  <w:style w:type="paragraph" w:styleId="Caption">
+    <w:name w:val="Caption"/>
+    <w:basedOn w:val="Normal"/>
+    <w:qFormat/>
+    <w:pPr>
+      <w:suppressLineNumbers/>
+      <w:spacing w:before="120" w:after="120"/>
+    </w:pPr>
+    <w:rPr>
+      <w:rFonts w:cs="FreeSans"/>
+      <w:i/>
+      <w:iCs/>
+      <w:sz w:val="24"/>
+      <w:szCs w:val="24"/>
+    </w:rPr>
+  </w:style>
+  <w:style w:type="paragraph" w:styleId="Indeks">
+    <w:name w:val="Indeks"/>
+    <w:basedOn w:val="Normal"/>
+    <w:qFormat/>
+    <w:pPr>
+      <w:suppressLineNumbers/>
+    </w:pPr>
+    <w:rPr>
+      <w:rFonts w:cs="FreeSans"/>
+    </w:rPr>
+  </w:style>
+  <w:style w:type="paragraph" w:styleId="Title">
+    <w:name w:val="Title"/>
+    <w:basedOn w:val="Normal"/>
+    <w:next w:val="Normal"/>
+    <w:link w:val="TytuZnak"/>
+    <w:uiPriority w:val="10"/>
+    <w:qFormat/>
+    <w:rsid w:val="000c1256"/>
+    <w:pPr>
+      <w:spacing w:before="0" w:after="80"/>
+      <w:contextualSpacing/>
+    </w:pPr>
+    <w:rPr>
+      <w:rFonts w:ascii="Aptos Display" w:hAnsi="Aptos Display" w:eastAsia="" w:cs="" w:asciiTheme="majorHAnsi" w:cstheme="majorBidi" w:eastAsiaTheme="majorEastAsia" w:hAnsiTheme="majorHAnsi"/>
+      <w:spacing w:val="-10"/>
+      <w:kern w:val="2"/>
+      <w:sz w:val="56"/>
+      <w:szCs w:val="56"/>
+    </w:rPr>
+  </w:style>
+  <w:style w:type="paragraph" w:styleId="Subtitle">
+    <w:name w:val="Subtitle"/>
+    <w:basedOn w:val="Normal"/>
+    <w:next w:val="Normal"/>
+    <w:link w:val="PodtytuZnak"/>
+    <w:uiPriority w:val="11"/>
+    <w:qFormat/>
+    <w:rsid w:val="000c1256"/>
+    <w:pPr/>
+    <w:rPr>
+      <w:rFonts w:eastAsia="" w:cs="" w:cstheme="majorBidi" w:eastAsiaTheme="majorEastAsia"/>
+      <w:color w:themeColor="text1" w:themeTint="a6" w:val="595959"/>
+      <w:spacing w:val="15"/>
+      <w:sz w:val="28"/>
+      <w:szCs w:val="28"/>
+    </w:rPr>
+  </w:style>
+  <w:style w:type="paragraph" w:styleId="Quote">
+    <w:name w:val="Quote"/>
+    <w:basedOn w:val="Normal"/>
+    <w:next w:val="Normal"/>
+    <w:link w:val="CytatZnak"/>
+    <w:uiPriority w:val="29"/>
+    <w:qFormat/>
+    <w:rsid w:val="000c1256"/>
+    <w:pPr>
+      <w:spacing w:before="160" w:after="120"/>
+      <w:jc w:val="center"/>
+    </w:pPr>
+    <w:rPr>
+      <w:i/>
+      <w:iCs/>
+      <w:color w:themeColor="text1" w:themeTint="bf" w:val="404040"/>
+    </w:rPr>
+  </w:style>
+  <w:style w:type="paragraph" w:styleId="ListParagraph">
+    <w:name w:val="List Paragraph"/>
+    <w:basedOn w:val="Normal"/>
+    <w:uiPriority w:val="34"/>
+    <w:qFormat/>
+    <w:rsid w:val="000c1256"/>
+    <w:pPr>
+      <w:spacing w:before="0" w:after="120"/>
+      <w:ind w:left="720"/>
+      <w:contextualSpacing/>
+    </w:pPr>
+    <w:rPr/>
+  </w:style>
+  <w:style w:type="paragraph" w:styleId="IntenseQuote">
+    <w:name w:val="Intense Quote"/>
+    <w:basedOn w:val="Normal"/>
+    <w:next w:val="Normal"/>
+    <w:link w:val="CytatintensywnyZnak"/>
+    <w:uiPriority w:val="30"/>
+    <w:qFormat/>
+    <w:rsid w:val="000c1256"/>
+    <w:pPr>
+      <w:pBdr>
+        <w:top w:val="single" w:sz="4" w:space="10" w:color="0F4761" w:themeColor="accent1" w:themeShade="bf"/>
+        <w:bottom w:val="single" w:sz="4" w:space="10" w:color="0F4761" w:themeColor="accent1" w:themeShade="bf"/>
+      </w:pBdr>
+      <w:spacing w:before="360" w:after="360"/>
+      <w:ind w:left="864" w:right="864"/>
+      <w:jc w:val="center"/>
+    </w:pPr>
+    <w:rPr>
+      <w:i/>
+      <w:iCs/>
+      <w:color w:themeColor="accent1" w:themeShade="bf" w:val="0F4761"/>
+    </w:rPr>
+  </w:style>
+  <w:style w:type="paragraph" w:styleId="Domylnie">
+    <w:name w:val="Domyślnie"/>
+    <w:qFormat/>
+    <w:pPr>
+      <w:widowControl/>
+      <w:tabs>
+        <w:tab w:val="left" w:pos="708" w:leader="none"/>
+      </w:tabs>
+      <w:suppressAutoHyphens w:val="true"/>
+      <w:bidi w:val="0"/>
+      <w:spacing w:lineRule="atLeast" w:line="100" w:before="0" w:after="0"/>
+      <w:jc w:val="left"/>
+    </w:pPr>
+    <w:rPr>
+      <w:rFonts w:ascii="Times New Roman" w:hAnsi="Times New Roman" w:eastAsia="Times New Roman" w:cs="Times New Roman"/>
+      <w:color w:val="00000A"/>
+      <w:kern w:val="2"/>
+      <w:sz w:val="24"/>
+      <w:szCs w:val="20"/>
+      <w:lang w:val="pl-PL" w:eastAsia="pl-PL" w:bidi="ar-SA"/>
+    </w:rPr>
+  </w:style>
+  <w:style w:type="numbering" w:styleId="Bezlisty" w:default="1">
+    <w:name w:val="Bez listy"/>
+    <w:uiPriority w:val="99"/>
+    <w:semiHidden/>
+    <w:unhideWhenUsed/>
+    <w:qFormat/>
   </w:style>
   <w:style w:type="table" w:default="1" w:styleId="Standardowy">
     <w:name w:val="Normal Table"/>
@@ -1596,7 +2026,6 @@
     <w:semiHidden/>
     <w:unhideWhenUsed/>
     <w:tblPr>
-      <w:tblInd w:w="0" w:type="dxa"/>
       <w:tblCellMar>
         <w:top w:w="0" w:type="dxa"/>
         <w:left w:w="108" w:type="dxa"/>
@@ -1605,495 +2034,101 @@
       </w:tblCellMar>
     </w:tblPr>
   </w:style>
-  <w:style w:type="numbering" w:default="1" w:styleId="Bezlisty">
-    <w:name w:val="No List"/>
-    <w:uiPriority w:val="99"/>
-    <w:semiHidden/>
-    <w:unhideWhenUsed/>
-  </w:style>
-  <w:style w:type="character" w:customStyle="1" w:styleId="Nagwek1Znak">
-    <w:name w:val="Nagłówek 1 Znak"/>
-    <w:basedOn w:val="Domylnaczcionkaakapitu"/>
-    <w:link w:val="Nagwek1"/>
-    <w:uiPriority w:val="9"/>
-    <w:rsid w:val="000C1256"/>
-    <w:rPr>
-      <w:rFonts w:asciiTheme="majorHAnsi" w:eastAsiaTheme="majorEastAsia" w:hAnsiTheme="majorHAnsi" w:cstheme="majorBidi"/>
-      <w:color w:val="0F4761" w:themeColor="accent1" w:themeShade="BF"/>
-      <w:sz w:val="40"/>
-      <w:szCs w:val="40"/>
-    </w:rPr>
-  </w:style>
-  <w:style w:type="character" w:customStyle="1" w:styleId="Nagwek2Znak">
-    <w:name w:val="Nagłówek 2 Znak"/>
-    <w:basedOn w:val="Domylnaczcionkaakapitu"/>
-    <w:link w:val="Nagwek2"/>
-    <w:uiPriority w:val="9"/>
-    <w:semiHidden/>
-    <w:rsid w:val="000C1256"/>
-    <w:rPr>
-      <w:rFonts w:asciiTheme="majorHAnsi" w:eastAsiaTheme="majorEastAsia" w:hAnsiTheme="majorHAnsi" w:cstheme="majorBidi"/>
-      <w:color w:val="0F4761" w:themeColor="accent1" w:themeShade="BF"/>
-      <w:sz w:val="32"/>
-      <w:szCs w:val="32"/>
-    </w:rPr>
-  </w:style>
-  <w:style w:type="character" w:customStyle="1" w:styleId="Nagwek3Znak">
-    <w:name w:val="Nagłówek 3 Znak"/>
-    <w:basedOn w:val="Domylnaczcionkaakapitu"/>
-    <w:link w:val="Nagwek3"/>
-    <w:uiPriority w:val="9"/>
-    <w:semiHidden/>
-    <w:rsid w:val="000C1256"/>
-    <w:rPr>
-      <w:rFonts w:eastAsiaTheme="majorEastAsia" w:cstheme="majorBidi"/>
-      <w:color w:val="0F4761" w:themeColor="accent1" w:themeShade="BF"/>
-      <w:sz w:val="28"/>
-      <w:szCs w:val="28"/>
-    </w:rPr>
-  </w:style>
-  <w:style w:type="character" w:customStyle="1" w:styleId="Nagwek4Znak">
-    <w:name w:val="Nagłówek 4 Znak"/>
-    <w:basedOn w:val="Domylnaczcionkaakapitu"/>
-    <w:link w:val="Nagwek4"/>
-    <w:uiPriority w:val="9"/>
-    <w:semiHidden/>
-    <w:rsid w:val="000C1256"/>
-    <w:rPr>
-      <w:rFonts w:eastAsiaTheme="majorEastAsia" w:cstheme="majorBidi"/>
-      <w:i/>
-      <w:iCs/>
-      <w:color w:val="0F4761" w:themeColor="accent1" w:themeShade="BF"/>
-    </w:rPr>
-  </w:style>
-  <w:style w:type="character" w:customStyle="1" w:styleId="Nagwek5Znak">
-    <w:name w:val="Nagłówek 5 Znak"/>
-    <w:basedOn w:val="Domylnaczcionkaakapitu"/>
-    <w:link w:val="Nagwek5"/>
-    <w:uiPriority w:val="9"/>
-    <w:semiHidden/>
-    <w:rsid w:val="000C1256"/>
-    <w:rPr>
-      <w:rFonts w:eastAsiaTheme="majorEastAsia" w:cstheme="majorBidi"/>
-      <w:color w:val="0F4761" w:themeColor="accent1" w:themeShade="BF"/>
-    </w:rPr>
-  </w:style>
-  <w:style w:type="character" w:customStyle="1" w:styleId="Nagwek6Znak">
-    <w:name w:val="Nagłówek 6 Znak"/>
-    <w:basedOn w:val="Domylnaczcionkaakapitu"/>
-    <w:link w:val="Nagwek6"/>
-    <w:uiPriority w:val="9"/>
-    <w:semiHidden/>
-    <w:rsid w:val="000C1256"/>
-    <w:rPr>
-      <w:rFonts w:eastAsiaTheme="majorEastAsia" w:cstheme="majorBidi"/>
-      <w:i/>
-      <w:iCs/>
-      <w:color w:val="595959" w:themeColor="text1" w:themeTint="A6"/>
-    </w:rPr>
-  </w:style>
-  <w:style w:type="character" w:customStyle="1" w:styleId="Nagwek7Znak">
-    <w:name w:val="Nagłówek 7 Znak"/>
-    <w:basedOn w:val="Domylnaczcionkaakapitu"/>
-    <w:link w:val="Nagwek7"/>
-    <w:uiPriority w:val="9"/>
-    <w:semiHidden/>
-    <w:rsid w:val="000C1256"/>
-    <w:rPr>
-      <w:rFonts w:eastAsiaTheme="majorEastAsia" w:cstheme="majorBidi"/>
-      <w:color w:val="595959" w:themeColor="text1" w:themeTint="A6"/>
-    </w:rPr>
-  </w:style>
-  <w:style w:type="character" w:customStyle="1" w:styleId="Nagwek8Znak">
-    <w:name w:val="Nagłówek 8 Znak"/>
-    <w:basedOn w:val="Domylnaczcionkaakapitu"/>
-    <w:link w:val="Nagwek8"/>
-    <w:uiPriority w:val="9"/>
-    <w:semiHidden/>
-    <w:rsid w:val="000C1256"/>
-    <w:rPr>
-      <w:rFonts w:eastAsiaTheme="majorEastAsia" w:cstheme="majorBidi"/>
-      <w:i/>
-      <w:iCs/>
-      <w:color w:val="272727" w:themeColor="text1" w:themeTint="D8"/>
-    </w:rPr>
-  </w:style>
-  <w:style w:type="character" w:customStyle="1" w:styleId="Nagwek9Znak">
-    <w:name w:val="Nagłówek 9 Znak"/>
-    <w:basedOn w:val="Domylnaczcionkaakapitu"/>
-    <w:link w:val="Nagwek9"/>
-    <w:uiPriority w:val="9"/>
-    <w:semiHidden/>
-    <w:rsid w:val="000C1256"/>
-    <w:rPr>
-      <w:rFonts w:eastAsiaTheme="majorEastAsia" w:cstheme="majorBidi"/>
-      <w:color w:val="272727" w:themeColor="text1" w:themeTint="D8"/>
-    </w:rPr>
-  </w:style>
-  <w:style w:type="paragraph" w:styleId="Tytu">
-    <w:name w:val="Title"/>
-    <w:basedOn w:val="Normalny"/>
-    <w:next w:val="Normalny"/>
-    <w:link w:val="TytuZnak"/>
-    <w:uiPriority w:val="10"/>
-    <w:qFormat/>
-    <w:rsid w:val="000C1256"/>
-    <w:pPr>
-      <w:spacing w:after="80"/>
-      <w:contextualSpacing/>
-    </w:pPr>
-    <w:rPr>
-      <w:rFonts w:asciiTheme="majorHAnsi" w:eastAsiaTheme="majorEastAsia" w:hAnsiTheme="majorHAnsi" w:cstheme="majorBidi"/>
-      <w:spacing w:val="-10"/>
-      <w:kern w:val="28"/>
-      <w:sz w:val="56"/>
-      <w:szCs w:val="56"/>
-    </w:rPr>
-  </w:style>
-  <w:style w:type="character" w:customStyle="1" w:styleId="TytuZnak">
-    <w:name w:val="Tytuł Znak"/>
-    <w:basedOn w:val="Domylnaczcionkaakapitu"/>
-    <w:link w:val="Tytu"/>
-    <w:uiPriority w:val="10"/>
-    <w:rsid w:val="000C1256"/>
-    <w:rPr>
-      <w:rFonts w:asciiTheme="majorHAnsi" w:eastAsiaTheme="majorEastAsia" w:hAnsiTheme="majorHAnsi" w:cstheme="majorBidi"/>
-      <w:spacing w:val="-10"/>
-      <w:kern w:val="28"/>
-      <w:sz w:val="56"/>
-      <w:szCs w:val="56"/>
-    </w:rPr>
-  </w:style>
-  <w:style w:type="paragraph" w:styleId="Podtytu">
-    <w:name w:val="Subtitle"/>
-    <w:basedOn w:val="Normalny"/>
-    <w:next w:val="Normalny"/>
-    <w:link w:val="PodtytuZnak"/>
-    <w:uiPriority w:val="11"/>
-    <w:qFormat/>
-    <w:rsid w:val="000C1256"/>
-    <w:pPr>
-      <w:numPr>
-        <w:ilvl w:val="1"/>
-      </w:numPr>
-    </w:pPr>
-    <w:rPr>
-      <w:rFonts w:eastAsiaTheme="majorEastAsia" w:cstheme="majorBidi"/>
-      <w:color w:val="595959" w:themeColor="text1" w:themeTint="A6"/>
-      <w:spacing w:val="15"/>
-      <w:sz w:val="28"/>
-      <w:szCs w:val="28"/>
-    </w:rPr>
-  </w:style>
-  <w:style w:type="character" w:customStyle="1" w:styleId="PodtytuZnak">
-    <w:name w:val="Podtytuł Znak"/>
-    <w:basedOn w:val="Domylnaczcionkaakapitu"/>
-    <w:link w:val="Podtytu"/>
-    <w:uiPriority w:val="11"/>
-    <w:rsid w:val="000C1256"/>
-    <w:rPr>
-      <w:rFonts w:eastAsiaTheme="majorEastAsia" w:cstheme="majorBidi"/>
-      <w:color w:val="595959" w:themeColor="text1" w:themeTint="A6"/>
-      <w:spacing w:val="15"/>
-      <w:sz w:val="28"/>
-      <w:szCs w:val="28"/>
-    </w:rPr>
-  </w:style>
-  <w:style w:type="paragraph" w:styleId="Cytat">
-    <w:name w:val="Quote"/>
-    <w:basedOn w:val="Normalny"/>
-    <w:next w:val="Normalny"/>
-    <w:link w:val="CytatZnak"/>
-    <w:uiPriority w:val="29"/>
-    <w:qFormat/>
-    <w:rsid w:val="000C1256"/>
-    <w:pPr>
-      <w:spacing w:before="160"/>
-      <w:jc w:val="center"/>
-    </w:pPr>
-    <w:rPr>
-      <w:i/>
-      <w:iCs/>
-      <w:color w:val="404040" w:themeColor="text1" w:themeTint="BF"/>
-    </w:rPr>
-  </w:style>
-  <w:style w:type="character" w:customStyle="1" w:styleId="CytatZnak">
-    <w:name w:val="Cytat Znak"/>
-    <w:basedOn w:val="Domylnaczcionkaakapitu"/>
-    <w:link w:val="Cytat"/>
-    <w:uiPriority w:val="29"/>
-    <w:rsid w:val="000C1256"/>
-    <w:rPr>
-      <w:i/>
-      <w:iCs/>
-      <w:color w:val="404040" w:themeColor="text1" w:themeTint="BF"/>
-    </w:rPr>
-  </w:style>
-  <w:style w:type="paragraph" w:styleId="Akapitzlist">
-    <w:name w:val="List Paragraph"/>
-    <w:basedOn w:val="Normalny"/>
-    <w:uiPriority w:val="34"/>
-    <w:qFormat/>
-    <w:rsid w:val="000C1256"/>
-    <w:pPr>
-      <w:ind w:left="720"/>
-      <w:contextualSpacing/>
-    </w:pPr>
-  </w:style>
-  <w:style w:type="character" w:styleId="Wyrnienieintensywne">
-    <w:name w:val="Intense Emphasis"/>
-    <w:basedOn w:val="Domylnaczcionkaakapitu"/>
-    <w:uiPriority w:val="21"/>
-    <w:qFormat/>
-    <w:rsid w:val="000C1256"/>
-    <w:rPr>
-      <w:i/>
-      <w:iCs/>
-      <w:color w:val="0F4761" w:themeColor="accent1" w:themeShade="BF"/>
-    </w:rPr>
-  </w:style>
-  <w:style w:type="paragraph" w:styleId="Cytatintensywny">
-    <w:name w:val="Intense Quote"/>
-    <w:basedOn w:val="Normalny"/>
-    <w:next w:val="Normalny"/>
-    <w:link w:val="CytatintensywnyZnak"/>
-    <w:uiPriority w:val="30"/>
-    <w:qFormat/>
-    <w:rsid w:val="000C1256"/>
-    <w:pPr>
-      <w:pBdr>
-        <w:top w:val="single" w:sz="4" w:space="10" w:color="0F4761" w:themeColor="accent1" w:themeShade="BF"/>
-        <w:bottom w:val="single" w:sz="4" w:space="10" w:color="0F4761" w:themeColor="accent1" w:themeShade="BF"/>
-      </w:pBdr>
-      <w:spacing w:before="360" w:after="360"/>
-      <w:ind w:left="864" w:right="864"/>
-      <w:jc w:val="center"/>
-    </w:pPr>
-    <w:rPr>
-      <w:i/>
-      <w:iCs/>
-      <w:color w:val="0F4761" w:themeColor="accent1" w:themeShade="BF"/>
-    </w:rPr>
-  </w:style>
-  <w:style w:type="character" w:customStyle="1" w:styleId="CytatintensywnyZnak">
-    <w:name w:val="Cytat intensywny Znak"/>
-    <w:basedOn w:val="Domylnaczcionkaakapitu"/>
-    <w:link w:val="Cytatintensywny"/>
-    <w:uiPriority w:val="30"/>
-    <w:rsid w:val="000C1256"/>
-    <w:rPr>
-      <w:i/>
-      <w:iCs/>
-      <w:color w:val="0F4761" w:themeColor="accent1" w:themeShade="BF"/>
-    </w:rPr>
-  </w:style>
-  <w:style w:type="character" w:styleId="Odwoanieintensywne">
-    <w:name w:val="Intense Reference"/>
-    <w:basedOn w:val="Domylnaczcionkaakapitu"/>
-    <w:uiPriority w:val="32"/>
-    <w:qFormat/>
-    <w:rsid w:val="000C1256"/>
-    <w:rPr>
-      <w:b/>
-      <w:bCs/>
-      <w:smallCaps/>
-      <w:color w:val="0F4761" w:themeColor="accent1" w:themeShade="BF"/>
-      <w:spacing w:val="5"/>
-    </w:rPr>
-  </w:style>
 </w:styles>
 </file>
 
 <file path=word/theme/theme1.xml><?xml version="1.0" encoding="utf-8"?>
-<a:theme xmlns:a="http://schemas.openxmlformats.org/drawingml/2006/main" name="Motyw pakietu Office">
+<a:theme xmlns:a="http://schemas.openxmlformats.org/drawingml/2006/main" xmlns:r="http://schemas.openxmlformats.org/officeDocument/2006/relationships" name="Motyw pakietu Office">
   <a:themeElements>
     <a:clrScheme name="Pakiet Office">
       <a:dk1>
-        <a:sysClr val="windowText" lastClr="000000"/>
+        <a:srgbClr val="000000"/>
       </a:dk1>
       <a:lt1>
-        <a:sysClr val="window" lastClr="FFFFFF"/>
+        <a:srgbClr val="ffffff"/>
       </a:lt1>
       <a:dk2>
-        <a:srgbClr val="0E2841"/>
+        <a:srgbClr val="0e2841"/>
       </a:dk2>
       <a:lt2>
-        <a:srgbClr val="E8E8E8"/>
+        <a:srgbClr val="e8e8e8"/>
       </a:lt2>
       <a:accent1>
         <a:srgbClr val="156082"/>
       </a:accent1>
       <a:accent2>
-        <a:srgbClr val="E97132"/>
+        <a:srgbClr val="e97132"/>
       </a:accent2>
       <a:accent3>
-        <a:srgbClr val="196B24"/>
+        <a:srgbClr val="196b24"/>
       </a:accent3>
       <a:accent4>
-        <a:srgbClr val="0F9ED5"/>
+        <a:srgbClr val="0f9ed5"/>
       </a:accent4>
       <a:accent5>
-        <a:srgbClr val="A02B93"/>
+        <a:srgbClr val="a02b93"/>
       </a:accent5>
       <a:accent6>
-        <a:srgbClr val="4EA72E"/>
+        <a:srgbClr val="4ea72e"/>
       </a:accent6>
       <a:hlink>
         <a:srgbClr val="467886"/>
       </a:hlink>
       <a:folHlink>
-        <a:srgbClr val="96607D"/>
+        <a:srgbClr val="96607d"/>
       </a:folHlink>
     </a:clrScheme>
     <a:fontScheme name="Pakiet Office">
       <a:majorFont>
-        <a:latin typeface="Aptos Display" panose="02110004020202020204"/>
+        <a:latin typeface="Aptos Display" panose="02110004020202020204" pitchFamily="0" charset="1"/>
         <a:ea typeface=""/>
         <a:cs typeface=""/>
-        <a:font script="Jpan" typeface="游ゴシック Light"/>
-        <a:font script="Hang" typeface="맑은 고딕"/>
-        <a:font script="Hans" typeface="等线 Light"/>
-        <a:font script="Hant" typeface="新細明體"/>
-        <a:font script="Arab" typeface="Times New Roman"/>
-        <a:font script="Hebr" typeface="Times New Roman"/>
-        <a:font script="Thai" typeface="Angsana New"/>
-        <a:font script="Ethi" typeface="Nyala"/>
-        <a:font script="Beng" typeface="Vrinda"/>
-        <a:font script="Gujr" typeface="Shruti"/>
-        <a:font script="Khmr" typeface="MoolBoran"/>
-        <a:font script="Knda" typeface="Tunga"/>
-        <a:font script="Guru" typeface="Raavi"/>
-        <a:font script="Cans" typeface="Euphemia"/>
-        <a:font script="Cher" typeface="Plantagenet Cherokee"/>
-        <a:font script="Yiii" typeface="Microsoft Yi Baiti"/>
-        <a:font script="Tibt" typeface="Microsoft Himalaya"/>
-        <a:font script="Thaa" typeface="MV Boli"/>
-        <a:font script="Deva" typeface="Mangal"/>
-        <a:font script="Telu" typeface="Gautami"/>
-        <a:font script="Taml" typeface="Latha"/>
-        <a:font script="Syrc" typeface="Estrangelo Edessa"/>
-        <a:font script="Orya" typeface="Kalinga"/>
-        <a:font script="Mlym" typeface="Kartika"/>
-        <a:font script="Laoo" typeface="DokChampa"/>
-        <a:font script="Sinh" typeface="Iskoola Pota"/>
-        <a:font script="Mong" typeface="Mongolian Baiti"/>
-        <a:font script="Viet" typeface="Times New Roman"/>
-        <a:font script="Uigh" typeface="Microsoft Uighur"/>
-        <a:font script="Geor" typeface="Sylfaen"/>
-        <a:font script="Armn" typeface="Arial"/>
-        <a:font script="Bugi" typeface="Leelawadee UI"/>
-        <a:font script="Bopo" typeface="Microsoft JhengHei"/>
-        <a:font script="Java" typeface="Javanese Text"/>
-        <a:font script="Lisu" typeface="Segoe UI"/>
-        <a:font script="Mymr" typeface="Myanmar Text"/>
-        <a:font script="Nkoo" typeface="Ebrima"/>
-        <a:font script="Olck" typeface="Nirmala UI"/>
-        <a:font script="Osma" typeface="Ebrima"/>
-        <a:font script="Phag" typeface="Phagspa"/>
-        <a:font script="Syrn" typeface="Estrangelo Edessa"/>
-        <a:font script="Syrj" typeface="Estrangelo Edessa"/>
-        <a:font script="Syre" typeface="Estrangelo Edessa"/>
-        <a:font script="Sora" typeface="Nirmala UI"/>
-        <a:font script="Tale" typeface="Microsoft Tai Le"/>
-        <a:font script="Talu" typeface="Microsoft New Tai Lue"/>
-        <a:font script="Tfng" typeface="Ebrima"/>
       </a:majorFont>
       <a:minorFont>
-        <a:latin typeface="Aptos" panose="02110004020202020204"/>
+        <a:latin typeface="Aptos" panose="02110004020202020204" pitchFamily="0" charset="1"/>
         <a:ea typeface=""/>
         <a:cs typeface=""/>
-        <a:font script="Jpan" typeface="游明朝"/>
-        <a:font script="Hang" typeface="맑은 고딕"/>
-        <a:font script="Hans" typeface="等线"/>
-        <a:font script="Hant" typeface="新細明體"/>
-        <a:font script="Arab" typeface="Arial"/>
-        <a:font script="Hebr" typeface="Arial"/>
-        <a:font script="Thai" typeface="Cordia New"/>
-        <a:font script="Ethi" typeface="Nyala"/>
-        <a:font script="Beng" typeface="Vrinda"/>
-        <a:font script="Gujr" typeface="Shruti"/>
-        <a:font script="Khmr" typeface="DaunPenh"/>
-        <a:font script="Knda" typeface="Tunga"/>
-        <a:font script="Guru" typeface="Raavi"/>
-        <a:font script="Cans" typeface="Euphemia"/>
-        <a:font script="Cher" typeface="Plantagenet Cherokee"/>
-        <a:font script="Yiii" typeface="Microsoft Yi Baiti"/>
-        <a:font script="Tibt" typeface="Microsoft Himalaya"/>
-        <a:font script="Thaa" typeface="MV Boli"/>
-        <a:font script="Deva" typeface="Mangal"/>
-        <a:font script="Telu" typeface="Gautami"/>
-        <a:font script="Taml" typeface="Latha"/>
-        <a:font script="Syrc" typeface="Estrangelo Edessa"/>
-        <a:font script="Orya" typeface="Kalinga"/>
-        <a:font script="Mlym" typeface="Kartika"/>
-        <a:font script="Laoo" typeface="DokChampa"/>
-        <a:font script="Sinh" typeface="Iskoola Pota"/>
-        <a:font script="Mong" typeface="Mongolian Baiti"/>
-        <a:font script="Viet" typeface="Arial"/>
-        <a:font script="Uigh" typeface="Microsoft Uighur"/>
-        <a:font script="Geor" typeface="Sylfaen"/>
-        <a:font script="Armn" typeface="Arial"/>
-        <a:font script="Bugi" typeface="Leelawadee UI"/>
-        <a:font script="Bopo" typeface="Microsoft JhengHei"/>
-        <a:font script="Java" typeface="Javanese Text"/>
-        <a:font script="Lisu" typeface="Segoe UI"/>
-        <a:font script="Mymr" typeface="Myanmar Text"/>
-        <a:font script="Nkoo" typeface="Ebrima"/>
-        <a:font script="Olck" typeface="Nirmala UI"/>
-        <a:font script="Osma" typeface="Ebrima"/>
-        <a:font script="Phag" typeface="Phagspa"/>
-        <a:font script="Syrn" typeface="Estrangelo Edessa"/>
-        <a:font script="Syrj" typeface="Estrangelo Edessa"/>
-        <a:font script="Syre" typeface="Estrangelo Edessa"/>
-        <a:font script="Sora" typeface="Nirmala UI"/>
-        <a:font script="Tale" typeface="Microsoft Tai Le"/>
-        <a:font script="Talu" typeface="Microsoft New Tai Lue"/>
-        <a:font script="Tfng" typeface="Ebrima"/>
       </a:minorFont>
     </a:fontScheme>
-    <a:fmtScheme name="Pakiet Office">
+    <a:fmtScheme>
       <a:fillStyleLst>
         <a:solidFill>
           <a:schemeClr val="phClr"/>
         </a:solidFill>
-        <a:gradFill rotWithShape="1">
+        <a:gradFill>
           <a:gsLst>
             <a:gs pos="0">
               <a:schemeClr val="phClr">
                 <a:lumMod val="110000"/>
-                <a:satMod val="105000"/>
                 <a:tint val="67000"/>
               </a:schemeClr>
             </a:gs>
             <a:gs pos="50000">
               <a:schemeClr val="phClr">
                 <a:lumMod val="105000"/>
-                <a:satMod val="103000"/>
                 <a:tint val="73000"/>
               </a:schemeClr>
             </a:gs>
             <a:gs pos="100000">
               <a:schemeClr val="phClr">
                 <a:lumMod val="105000"/>
-                <a:satMod val="109000"/>
                 <a:tint val="81000"/>
               </a:schemeClr>
             </a:gs>
           </a:gsLst>
           <a:lin ang="5400000" scaled="0"/>
+          <a:tileRect l="0" t="0" r="0" b="0"/>
         </a:gradFill>
-        <a:gradFill rotWithShape="1">
+        <a:gradFill>
           <a:gsLst>
             <a:gs pos="0">
               <a:schemeClr val="phClr">
-                <a:satMod val="103000"/>
                 <a:lumMod val="102000"/>
                 <a:tint val="94000"/>
               </a:schemeClr>
             </a:gs>
             <a:gs pos="50000">
               <a:schemeClr val="phClr">
-                <a:satMod val="110000"/>
                 <a:lumMod val="100000"/>
                 <a:shade val="100000"/>
               </a:schemeClr>
@@ -2101,33 +2136,24 @@
             <a:gs pos="100000">
               <a:schemeClr val="phClr">
                 <a:lumMod val="99000"/>
-                <a:satMod val="120000"/>
                 <a:shade val="78000"/>
               </a:schemeClr>
             </a:gs>
           </a:gsLst>
           <a:lin ang="5400000" scaled="0"/>
+          <a:tileRect l="0" t="0" r="0" b="0"/>
         </a:gradFill>
       </a:fillStyleLst>
       <a:lnStyleLst>
         <a:ln w="12700" cap="flat" cmpd="sng" algn="ctr">
-          <a:solidFill>
-            <a:schemeClr val="phClr"/>
-          </a:solidFill>
           <a:prstDash val="solid"/>
           <a:miter lim="800000"/>
         </a:ln>
         <a:ln w="19050" cap="flat" cmpd="sng" algn="ctr">
-          <a:solidFill>
-            <a:schemeClr val="phClr"/>
-          </a:solidFill>
           <a:prstDash val="solid"/>
           <a:miter lim="800000"/>
         </a:ln>
         <a:ln w="25400" cap="flat" cmpd="sng" algn="ctr">
-          <a:solidFill>
-            <a:schemeClr val="phClr"/>
-          </a:solidFill>
           <a:prstDash val="solid"/>
           <a:miter lim="800000"/>
         </a:ln>
@@ -2140,13 +2166,7 @@
           <a:effectLst/>
         </a:effectStyle>
         <a:effectStyle>
-          <a:effectLst>
-            <a:outerShdw blurRad="57150" dist="19050" dir="5400000" algn="ctr" rotWithShape="0">
-              <a:srgbClr val="000000">
-                <a:alpha val="63000"/>
-              </a:srgbClr>
-            </a:outerShdw>
-          </a:effectLst>
+          <a:effectLst/>
         </a:effectStyle>
       </a:effectStyleLst>
       <a:bgFillStyleLst>
@@ -2156,15 +2176,13 @@
         <a:solidFill>
           <a:schemeClr val="phClr">
             <a:tint val="95000"/>
-            <a:satMod val="170000"/>
           </a:schemeClr>
         </a:solidFill>
-        <a:gradFill rotWithShape="1">
+        <a:gradFill>
           <a:gsLst>
             <a:gs pos="0">
               <a:schemeClr val="phClr">
                 <a:tint val="93000"/>
-                <a:satMod val="150000"/>
                 <a:shade val="98000"/>
                 <a:lumMod val="102000"/>
               </a:schemeClr>
@@ -2172,7 +2190,6 @@
             <a:gs pos="50000">
               <a:schemeClr val="phClr">
                 <a:tint val="98000"/>
-                <a:satMod val="130000"/>
                 <a:shade val="90000"/>
                 <a:lumMod val="103000"/>
               </a:schemeClr>
@@ -2180,41 +2197,14 @@
             <a:gs pos="100000">
               <a:schemeClr val="phClr">
                 <a:shade val="63000"/>
-                <a:satMod val="120000"/>
               </a:schemeClr>
             </a:gs>
           </a:gsLst>
           <a:lin ang="5400000" scaled="0"/>
+          <a:tileRect l="0" t="0" r="0" b="0"/>
         </a:gradFill>
       </a:bgFillStyleLst>
     </a:fmtScheme>
   </a:themeElements>
-  <a:objectDefaults>
-    <a:lnDef>
-      <a:spPr/>
-      <a:bodyPr/>
-      <a:lstStyle/>
-      <a:style>
-        <a:lnRef idx="2">
-          <a:schemeClr val="accent1"/>
-        </a:lnRef>
-        <a:fillRef idx="0">
-          <a:schemeClr val="accent1"/>
-        </a:fillRef>
-        <a:effectRef idx="1">
-          <a:schemeClr val="accent1"/>
-        </a:effectRef>
-        <a:fontRef idx="minor">
-          <a:schemeClr val="tx1"/>
-        </a:fontRef>
-      </a:style>
-    </a:lnDef>
-  </a:objectDefaults>
-  <a:extraClrSchemeLst/>
-  <a:extLst>
-    <a:ext uri="{05A4C25C-085E-4340-85A3-A5531E510DB2}">
-      <thm15:themeFamily xmlns:thm15="http://schemas.microsoft.com/office/thememl/2012/main" name="Office Theme" id="{2E142A2C-CD16-42D6-873A-C26D2A0506FA}" vid="{1BDDFF52-6CD6-40A5-AB3C-68EB2F1E4D0A}"/>
-    </a:ext>
-  </a:extLst>
 </a:theme>
 </file>
</xml_diff>

<commit_message>
Dopisanie wyników do Charakterystyki 2026.
</commit_message>
<xml_diff>
--- a/Charakterystyki/Charakterystyka_nauczycieli_2026.docx
+++ b/Charakterystyki/Charakterystyka_nauczycieli_2026.docx
@@ -306,7 +306,7 @@
                       <w:rFonts w:cs="Calibri"/>
                       <w:szCs w:val="22"/>
                     </w:rPr>
-                    <w:t xml:space="preserve">Typ zajęć </w:t>
+                    <w:t>Typ zajęć</w:t>
                   </w:r>
                 </w:p>
               </w:tc>
@@ -837,15 +837,258 @@
           </w:tcPr>
           <w:p>
             <w:pPr>
-              <w:pStyle w:val="Normal"/>
-              <w:widowControl/>
-              <w:bidi w:val="0"/>
-              <w:spacing w:lineRule="auto" w:line="240" w:before="0" w:after="120"/>
+              <w:pStyle w:val="Domylnie"/>
               <w:jc w:val="both"/>
               <w:rPr/>
             </w:pPr>
             <w:r>
               <w:rPr/>
+              <w:t>Deskryptywna teoria mnogości ze szczególnym uwzględnieniem jej zastosowań do: teorii funkcji rzeczywistych, analizy matematycznej (teoria szeregów), topologii prostej rzeczywistej (topologia gęstości). Własności topologiczne i algebraiczne całkowicie niedoskonałych podzbiorów prostej rzeczywistej i innych grup topologicznych (przestrzeń Cantora), własności ideałów podzbiorów zbioru liczb naturalnych.</w:t>
+            </w:r>
+          </w:p>
+          <w:p>
+            <w:pPr>
+              <w:pStyle w:val="Domylnie"/>
+              <w:jc w:val="both"/>
+              <w:rPr/>
+            </w:pPr>
+            <w:r>
+              <w:rPr/>
+            </w:r>
+          </w:p>
+          <w:p>
+            <w:pPr>
+              <w:pStyle w:val="Domylnie"/>
+              <w:jc w:val="both"/>
+              <w:rPr/>
+            </w:pPr>
+            <w:r>
+              <w:rPr/>
+              <w:t xml:space="preserve">* Zbadanie ogólnych własności </w:t>
+            </w:r>
+            <w:r>
+              <w:rPr/>
+              <w:t xml:space="preserve">tak zwanego </w:t>
+            </w:r>
+            <w:r>
+              <w:rPr/>
+              <w:t>ideału Sidona (</w:t>
+            </w:r>
+            <w:r>
+              <w:rPr/>
+              <w:t>2025)</w:t>
+            </w:r>
+          </w:p>
+          <w:p>
+            <w:pPr>
+              <w:pStyle w:val="Domylnie"/>
+              <w:jc w:val="both"/>
+              <w:rPr/>
+            </w:pPr>
+            <w:r>
+              <w:rPr/>
+              <w:t>* Sformułowanie warunku równoważnego pewnym opublikowanym w literaturze</w:t>
+            </w:r>
+          </w:p>
+          <w:p>
+            <w:pPr>
+              <w:pStyle w:val="Domylnie"/>
+              <w:jc w:val="both"/>
+              <w:rPr/>
+            </w:pPr>
+            <w:r>
+              <w:rPr/>
+              <w:t>kombinatorycznym własnościom sigma-ideałów w języku porządku Katětova</w:t>
+            </w:r>
+          </w:p>
+          <w:p>
+            <w:pPr>
+              <w:pStyle w:val="Domylnie"/>
+              <w:jc w:val="both"/>
+              <w:rPr/>
+            </w:pPr>
+            <w:r>
+              <w:rPr/>
+              <w:t>(ale między sigma-ideałami) i z wykorzystaniem sigma ideału zbiorów</w:t>
+            </w:r>
+          </w:p>
+          <w:p>
+            <w:pPr>
+              <w:pStyle w:val="Domylnie"/>
+              <w:jc w:val="both"/>
+              <w:rPr/>
+            </w:pPr>
+            <w:r>
+              <w:rPr/>
+              <w:t>Całkowicie Ramseya zero (</w:t>
+            </w:r>
+            <w:r>
+              <w:rPr/>
+              <w:t>2026</w:t>
+            </w:r>
+            <w:r>
+              <w:rPr/>
+              <w:t>).</w:t>
+            </w:r>
+          </w:p>
+          <w:p>
+            <w:pPr>
+              <w:pStyle w:val="Domylnie"/>
+              <w:jc w:val="both"/>
+              <w:rPr/>
+            </w:pPr>
+            <w:r>
+              <w:rPr/>
+              <w:t>* Abstrakcyjna ogólna definicja zbiorów ``not Piecewise Syndetic'' - zbadanie</w:t>
+            </w:r>
+          </w:p>
+          <w:p>
+            <w:pPr>
+              <w:pStyle w:val="Domylnie"/>
+              <w:jc w:val="both"/>
+              <w:rPr/>
+            </w:pPr>
+            <w:r>
+              <w:rPr/>
+              <w:t xml:space="preserve">jej własności i zastosowań </w:t>
+            </w:r>
+            <w:r>
+              <w:rPr/>
+              <w:t>(praca wspólna 2025</w:t>
+            </w:r>
+            <w:r>
+              <w:rPr/>
+              <w:t>).</w:t>
+            </w:r>
+          </w:p>
+          <w:p>
+            <w:pPr>
+              <w:pStyle w:val="Domylnie"/>
+              <w:jc w:val="both"/>
+              <w:rPr/>
+            </w:pPr>
+            <w:r>
+              <w:rPr/>
+              <w:t>* Ideał generowany przez ideały: nie Piecewise Syndetic, ideał</w:t>
+            </w:r>
+          </w:p>
+          <w:p>
+            <w:pPr>
+              <w:pStyle w:val="Domylnie"/>
+              <w:jc w:val="both"/>
+              <w:rPr/>
+            </w:pPr>
+            <w:r>
+              <w:rPr/>
+              <w:t>Hindmana oraz ideał zbiorów o asymptotycznej gęstości zero jest</w:t>
+            </w:r>
+          </w:p>
+          <w:p>
+            <w:pPr>
+              <w:pStyle w:val="Domylnie"/>
+              <w:jc w:val="both"/>
+              <w:rPr/>
+            </w:pPr>
+            <w:r>
+              <w:rPr/>
+              <w:t>ideałem właściwym (</w:t>
+            </w:r>
+            <w:r>
+              <w:rPr/>
+              <w:t>praca wspólna, 2025</w:t>
+            </w:r>
+            <w:r>
+              <w:rPr/>
+              <w:t>).</w:t>
+            </w:r>
+          </w:p>
+          <w:p>
+            <w:pPr>
+              <w:pStyle w:val="Domylnie"/>
+              <w:jc w:val="both"/>
+              <w:rPr/>
+            </w:pPr>
+            <w:r>
+              <w:rPr/>
+              <w:t>* Udowodniono że dla rodziny F podzbiorów zbioru liczb naturalnych zamkniętej ,,w górę'' mamy</w:t>
+            </w:r>
+          </w:p>
+          <w:p>
+            <w:pPr>
+              <w:pStyle w:val="Domylnie"/>
+              <w:jc w:val="both"/>
+              <w:rPr/>
+            </w:pPr>
+            <w:r>
+              <w:rPr/>
+              <w:t xml:space="preserve">  </w:t>
+            </w:r>
+            <w:r>
+              <w:rPr/>
+              <w:t>Perm(F^*) = Perm(F^+) = Perm(F^+ \cap F^*) = Perm(F^+ \cup F^*),</w:t>
+            </w:r>
+          </w:p>
+          <w:p>
+            <w:pPr>
+              <w:pStyle w:val="Domylnie"/>
+              <w:jc w:val="both"/>
+              <w:rPr/>
+            </w:pPr>
+            <w:r>
+              <w:rPr/>
+              <w:t xml:space="preserve">i że mamy też </w:t>
+            </w:r>
+          </w:p>
+          <w:p>
+            <w:pPr>
+              <w:pStyle w:val="Domylnie"/>
+              <w:jc w:val="both"/>
+              <w:rPr/>
+            </w:pPr>
+            <w:r>
+              <w:rPr/>
+              <w:t>nPS = Perm(Thick^*) = Perm(Thick^+) = Perm(Thick^+ \cap Thick^*) = Perm(Thick^+ \cup Thick^*),</w:t>
+            </w:r>
+          </w:p>
+          <w:p>
+            <w:pPr>
+              <w:pStyle w:val="Domylnie"/>
+              <w:jc w:val="both"/>
+              <w:rPr/>
+            </w:pPr>
+            <w:r>
+              <w:rPr/>
+              <w:t>(gdzie nPS to ideał zbiorów non piecewise syndetic; Thick to rodzina zbiorów "thick";</w:t>
+            </w:r>
+          </w:p>
+          <w:p>
+            <w:pPr>
+              <w:pStyle w:val="Domylnie"/>
+              <w:jc w:val="both"/>
+              <w:rPr/>
+            </w:pPr>
+            <w:r>
+              <w:rPr/>
+              <w:t>Perm(F) to rodzina tych A że dla każdego B z F, A \cup B jest też w F).</w:t>
+            </w:r>
+          </w:p>
+          <w:p>
+            <w:pPr>
+              <w:pStyle w:val="Domylnie"/>
+              <w:jc w:val="both"/>
+              <w:rPr/>
+            </w:pPr>
+            <w:r>
+              <w:rPr/>
+              <w:t>(</w:t>
+            </w:r>
+            <w:r>
+              <w:rPr/>
+              <w:t>praca wspólna, 2026</w:t>
+            </w:r>
+            <w:r>
+              <w:rPr/>
+              <w:t>);</w:t>
             </w:r>
           </w:p>
         </w:tc>
@@ -916,19 +1159,7 @@
             </w:pPr>
             <w:r>
               <w:rPr/>
-              <w:t xml:space="preserve">Wieloletnie członkostwo w </w:t>
-            </w:r>
-            <w:r>
-              <w:rPr/>
-              <w:t xml:space="preserve">Pomorskim </w:t>
-            </w:r>
-            <w:r>
-              <w:rPr/>
-              <w:t xml:space="preserve">Komitecie Olimpiady Matematycznej (co najmniej 10 lat) – </w:t>
-            </w:r>
-            <w:r>
-              <w:rPr/>
-              <w:t>sprawdzanie prac konkursowych. Prowadzenie na Uniwersytecie Gdańskim wielu wykładów w języku angielskim (kombinatoryka, teoria liczb (zastępstwo)).</w:t>
+              <w:t>Wieloletnie członkostwo w Pomorskim Komitecie Olimpiady Matematycznej (co najmniej 10 lat) – sprawdzanie prac konkursowych. Prowadzenie na Uniwersytecie Gdańskim wielu wykładów w języku angielskim (kombinatoryka, teoria liczb (zastępstwo)).</w:t>
             </w:r>
           </w:p>
         </w:tc>
@@ -1025,7 +1256,7 @@
   <w:docDefaults>
     <w:rPrDefault>
       <w:rPr>
-        <w:rFonts w:ascii="Aptos" w:hAnsi="Aptos" w:eastAsia="Aptos" w:cs="" w:asciiTheme="minorHAnsi" w:cstheme="minorBidi" w:eastAsiaTheme="minorHAnsi" w:hAnsiTheme="minorHAnsi"/>
+        <w:rFonts w:ascii="Arial" w:hAnsi="Arial" w:eastAsia="Arial" w:cs="DejaVu Sans" w:asciiTheme="minorHAnsi" w:cstheme="minorBidi" w:eastAsiaTheme="minorHAnsi" w:hAnsiTheme="minorHAnsi"/>
         <w:kern w:val="2"/>
         <w:sz w:val="24"/>
         <w:szCs w:val="24"/>
@@ -1423,6 +1654,7 @@
     <w:rsid w:val="007f4e6d"/>
     <w:pPr>
       <w:widowControl/>
+      <w:suppressAutoHyphens w:val="true"/>
       <w:bidi w:val="0"/>
       <w:spacing w:lineRule="auto" w:line="240" w:before="0" w:after="120"/>
       <w:jc w:val="both"/>
@@ -1433,7 +1665,7 @@
       <w:kern w:val="0"/>
       <w:sz w:val="22"/>
       <w:szCs w:val="24"/>
-      <w:lang w:eastAsia="pl-PL" w:val="pl-PL" w:bidi="ar-SA"/>
+      <w:lang w:val="pl-PL" w:eastAsia="pl-PL" w:bidi="ar-SA"/>
       <w14:ligatures w14:val="none"/>
     </w:rPr>
   </w:style>
@@ -1452,7 +1684,7 @@
       <w:outlineLvl w:val="0"/>
     </w:pPr>
     <w:rPr>
-      <w:rFonts w:ascii="Aptos Display" w:hAnsi="Aptos Display" w:eastAsia="" w:cs="" w:asciiTheme="majorHAnsi" w:cstheme="majorBidi" w:eastAsiaTheme="majorEastAsia" w:hAnsiTheme="majorHAnsi"/>
+      <w:rFonts w:ascii="Arial" w:hAnsi="Arial" w:eastAsia="DejaVu Sans" w:cs="DejaVu Sans" w:asciiTheme="majorHAnsi" w:cstheme="majorBidi" w:eastAsiaTheme="majorEastAsia" w:hAnsiTheme="majorHAnsi"/>
       <w:color w:themeColor="accent1" w:themeShade="bf" w:val="0F4761"/>
       <w:sz w:val="40"/>
       <w:szCs w:val="40"/>
@@ -1475,7 +1707,7 @@
       <w:outlineLvl w:val="1"/>
     </w:pPr>
     <w:rPr>
-      <w:rFonts w:ascii="Aptos Display" w:hAnsi="Aptos Display" w:eastAsia="" w:cs="" w:asciiTheme="majorHAnsi" w:cstheme="majorBidi" w:eastAsiaTheme="majorEastAsia" w:hAnsiTheme="majorHAnsi"/>
+      <w:rFonts w:ascii="Arial" w:hAnsi="Arial" w:eastAsia="DejaVu Sans" w:cs="DejaVu Sans" w:asciiTheme="majorHAnsi" w:cstheme="majorBidi" w:eastAsiaTheme="majorEastAsia" w:hAnsiTheme="majorHAnsi"/>
       <w:color w:themeColor="accent1" w:themeShade="bf" w:val="0F4761"/>
       <w:sz w:val="32"/>
       <w:szCs w:val="32"/>
@@ -1498,7 +1730,7 @@
       <w:outlineLvl w:val="2"/>
     </w:pPr>
     <w:rPr>
-      <w:rFonts w:eastAsia="" w:cs="" w:cstheme="majorBidi" w:eastAsiaTheme="majorEastAsia"/>
+      <w:rFonts w:eastAsia="DejaVu Sans" w:cs="DejaVu Sans" w:cstheme="majorBidi" w:eastAsiaTheme="majorEastAsia"/>
       <w:color w:themeColor="accent1" w:themeShade="bf" w:val="0F4761"/>
       <w:sz w:val="28"/>
       <w:szCs w:val="28"/>
@@ -1521,7 +1753,7 @@
       <w:outlineLvl w:val="3"/>
     </w:pPr>
     <w:rPr>
-      <w:rFonts w:eastAsia="" w:cs="" w:cstheme="majorBidi" w:eastAsiaTheme="majorEastAsia"/>
+      <w:rFonts w:eastAsia="DejaVu Sans" w:cs="DejaVu Sans" w:cstheme="majorBidi" w:eastAsiaTheme="majorEastAsia"/>
       <w:i/>
       <w:iCs/>
       <w:color w:themeColor="accent1" w:themeShade="bf" w:val="0F4761"/>
@@ -1544,7 +1776,7 @@
       <w:outlineLvl w:val="4"/>
     </w:pPr>
     <w:rPr>
-      <w:rFonts w:eastAsia="" w:cs="" w:cstheme="majorBidi" w:eastAsiaTheme="majorEastAsia"/>
+      <w:rFonts w:eastAsia="DejaVu Sans" w:cs="DejaVu Sans" w:cstheme="majorBidi" w:eastAsiaTheme="majorEastAsia"/>
       <w:color w:themeColor="accent1" w:themeShade="bf" w:val="0F4761"/>
     </w:rPr>
   </w:style>
@@ -1565,7 +1797,7 @@
       <w:outlineLvl w:val="5"/>
     </w:pPr>
     <w:rPr>
-      <w:rFonts w:eastAsia="" w:cs="" w:cstheme="majorBidi" w:eastAsiaTheme="majorEastAsia"/>
+      <w:rFonts w:eastAsia="DejaVu Sans" w:cs="DejaVu Sans" w:cstheme="majorBidi" w:eastAsiaTheme="majorEastAsia"/>
       <w:i/>
       <w:iCs/>
       <w:color w:themeColor="text1" w:themeTint="a6" w:val="595959"/>
@@ -1588,7 +1820,7 @@
       <w:outlineLvl w:val="6"/>
     </w:pPr>
     <w:rPr>
-      <w:rFonts w:eastAsia="" w:cs="" w:cstheme="majorBidi" w:eastAsiaTheme="majorEastAsia"/>
+      <w:rFonts w:eastAsia="DejaVu Sans" w:cs="DejaVu Sans" w:cstheme="majorBidi" w:eastAsiaTheme="majorEastAsia"/>
       <w:color w:themeColor="text1" w:themeTint="a6" w:val="595959"/>
     </w:rPr>
   </w:style>
@@ -1609,7 +1841,7 @@
       <w:outlineLvl w:val="7"/>
     </w:pPr>
     <w:rPr>
-      <w:rFonts w:eastAsia="" w:cs="" w:cstheme="majorBidi" w:eastAsiaTheme="majorEastAsia"/>
+      <w:rFonts w:eastAsia="DejaVu Sans" w:cs="DejaVu Sans" w:cstheme="majorBidi" w:eastAsiaTheme="majorEastAsia"/>
       <w:i/>
       <w:iCs/>
       <w:color w:themeColor="text1" w:themeTint="d8" w:val="272727"/>
@@ -1632,7 +1864,7 @@
       <w:outlineLvl w:val="8"/>
     </w:pPr>
     <w:rPr>
-      <w:rFonts w:eastAsia="" w:cs="" w:cstheme="majorBidi" w:eastAsiaTheme="majorEastAsia"/>
+      <w:rFonts w:eastAsia="DejaVu Sans" w:cs="DejaVu Sans" w:cstheme="majorBidi" w:eastAsiaTheme="majorEastAsia"/>
       <w:color w:themeColor="text1" w:themeTint="d8" w:val="272727"/>
     </w:rPr>
   </w:style>
@@ -1650,7 +1882,7 @@
     <w:qFormat/>
     <w:rsid w:val="000c1256"/>
     <w:rPr>
-      <w:rFonts w:ascii="Aptos Display" w:hAnsi="Aptos Display" w:eastAsia="" w:cs="" w:asciiTheme="majorHAnsi" w:cstheme="majorBidi" w:eastAsiaTheme="majorEastAsia" w:hAnsiTheme="majorHAnsi"/>
+      <w:rFonts w:ascii="Arial" w:hAnsi="Arial" w:eastAsia="DejaVu Sans" w:cs="DejaVu Sans" w:asciiTheme="majorHAnsi" w:cstheme="majorBidi" w:eastAsiaTheme="majorEastAsia" w:hAnsiTheme="majorHAnsi"/>
       <w:color w:themeColor="accent1" w:themeShade="bf" w:val="0F4761"/>
       <w:sz w:val="40"/>
       <w:szCs w:val="40"/>
@@ -1664,7 +1896,7 @@
     <w:qFormat/>
     <w:rsid w:val="000c1256"/>
     <w:rPr>
-      <w:rFonts w:ascii="Aptos Display" w:hAnsi="Aptos Display" w:eastAsia="" w:cs="" w:asciiTheme="majorHAnsi" w:cstheme="majorBidi" w:eastAsiaTheme="majorEastAsia" w:hAnsiTheme="majorHAnsi"/>
+      <w:rFonts w:ascii="Arial" w:hAnsi="Arial" w:eastAsia="DejaVu Sans" w:cs="DejaVu Sans" w:asciiTheme="majorHAnsi" w:cstheme="majorBidi" w:eastAsiaTheme="majorEastAsia" w:hAnsiTheme="majorHAnsi"/>
       <w:color w:themeColor="accent1" w:themeShade="bf" w:val="0F4761"/>
       <w:sz w:val="32"/>
       <w:szCs w:val="32"/>
@@ -1678,7 +1910,7 @@
     <w:qFormat/>
     <w:rsid w:val="000c1256"/>
     <w:rPr>
-      <w:rFonts w:eastAsia="" w:cs="" w:cstheme="majorBidi" w:eastAsiaTheme="majorEastAsia"/>
+      <w:rFonts w:eastAsia="DejaVu Sans" w:cs="DejaVu Sans" w:cstheme="majorBidi" w:eastAsiaTheme="majorEastAsia"/>
       <w:color w:themeColor="accent1" w:themeShade="bf" w:val="0F4761"/>
       <w:sz w:val="28"/>
       <w:szCs w:val="28"/>
@@ -1692,7 +1924,7 @@
     <w:qFormat/>
     <w:rsid w:val="000c1256"/>
     <w:rPr>
-      <w:rFonts w:eastAsia="" w:cs="" w:cstheme="majorBidi" w:eastAsiaTheme="majorEastAsia"/>
+      <w:rFonts w:eastAsia="DejaVu Sans" w:cs="DejaVu Sans" w:cstheme="majorBidi" w:eastAsiaTheme="majorEastAsia"/>
       <w:i/>
       <w:iCs/>
       <w:color w:themeColor="accent1" w:themeShade="bf" w:val="0F4761"/>
@@ -1706,7 +1938,7 @@
     <w:qFormat/>
     <w:rsid w:val="000c1256"/>
     <w:rPr>
-      <w:rFonts w:eastAsia="" w:cs="" w:cstheme="majorBidi" w:eastAsiaTheme="majorEastAsia"/>
+      <w:rFonts w:eastAsia="DejaVu Sans" w:cs="DejaVu Sans" w:cstheme="majorBidi" w:eastAsiaTheme="majorEastAsia"/>
       <w:color w:themeColor="accent1" w:themeShade="bf" w:val="0F4761"/>
     </w:rPr>
   </w:style>
@@ -1718,7 +1950,7 @@
     <w:qFormat/>
     <w:rsid w:val="000c1256"/>
     <w:rPr>
-      <w:rFonts w:eastAsia="" w:cs="" w:cstheme="majorBidi" w:eastAsiaTheme="majorEastAsia"/>
+      <w:rFonts w:eastAsia="DejaVu Sans" w:cs="DejaVu Sans" w:cstheme="majorBidi" w:eastAsiaTheme="majorEastAsia"/>
       <w:i/>
       <w:iCs/>
       <w:color w:themeColor="text1" w:themeTint="a6" w:val="595959"/>
@@ -1732,7 +1964,7 @@
     <w:qFormat/>
     <w:rsid w:val="000c1256"/>
     <w:rPr>
-      <w:rFonts w:eastAsia="" w:cs="" w:cstheme="majorBidi" w:eastAsiaTheme="majorEastAsia"/>
+      <w:rFonts w:eastAsia="DejaVu Sans" w:cs="DejaVu Sans" w:cstheme="majorBidi" w:eastAsiaTheme="majorEastAsia"/>
       <w:color w:themeColor="text1" w:themeTint="a6" w:val="595959"/>
     </w:rPr>
   </w:style>
@@ -1744,7 +1976,7 @@
     <w:qFormat/>
     <w:rsid w:val="000c1256"/>
     <w:rPr>
-      <w:rFonts w:eastAsia="" w:cs="" w:cstheme="majorBidi" w:eastAsiaTheme="majorEastAsia"/>
+      <w:rFonts w:eastAsia="DejaVu Sans" w:cs="DejaVu Sans" w:cstheme="majorBidi" w:eastAsiaTheme="majorEastAsia"/>
       <w:i/>
       <w:iCs/>
       <w:color w:themeColor="text1" w:themeTint="d8" w:val="272727"/>
@@ -1758,7 +1990,7 @@
     <w:qFormat/>
     <w:rsid w:val="000c1256"/>
     <w:rPr>
-      <w:rFonts w:eastAsia="" w:cs="" w:cstheme="majorBidi" w:eastAsiaTheme="majorEastAsia"/>
+      <w:rFonts w:eastAsia="DejaVu Sans" w:cs="DejaVu Sans" w:cstheme="majorBidi" w:eastAsiaTheme="majorEastAsia"/>
       <w:color w:themeColor="text1" w:themeTint="d8" w:val="272727"/>
     </w:rPr>
   </w:style>
@@ -1769,7 +2001,7 @@
     <w:qFormat/>
     <w:rsid w:val="000c1256"/>
     <w:rPr>
-      <w:rFonts w:ascii="Aptos Display" w:hAnsi="Aptos Display" w:eastAsia="" w:cs="" w:asciiTheme="majorHAnsi" w:cstheme="majorBidi" w:eastAsiaTheme="majorEastAsia" w:hAnsiTheme="majorHAnsi"/>
+      <w:rFonts w:ascii="Arial" w:hAnsi="Arial" w:eastAsia="DejaVu Sans" w:cs="DejaVu Sans" w:asciiTheme="majorHAnsi" w:cstheme="majorBidi" w:eastAsiaTheme="majorEastAsia" w:hAnsiTheme="majorHAnsi"/>
       <w:spacing w:val="-10"/>
       <w:kern w:val="2"/>
       <w:sz w:val="56"/>
@@ -1783,7 +2015,7 @@
     <w:qFormat/>
     <w:rsid w:val="000c1256"/>
     <w:rPr>
-      <w:rFonts w:eastAsia="" w:cs="" w:cstheme="majorBidi" w:eastAsiaTheme="majorEastAsia"/>
+      <w:rFonts w:eastAsia="DejaVu Sans" w:cs="DejaVu Sans" w:cstheme="majorBidi" w:eastAsiaTheme="majorEastAsia"/>
       <w:color w:themeColor="text1" w:themeTint="a6" w:val="595959"/>
       <w:spacing w:val="15"/>
       <w:sz w:val="28"/>
@@ -1913,7 +2145,7 @@
       <w:contextualSpacing/>
     </w:pPr>
     <w:rPr>
-      <w:rFonts w:ascii="Aptos Display" w:hAnsi="Aptos Display" w:eastAsia="" w:cs="" w:asciiTheme="majorHAnsi" w:cstheme="majorBidi" w:eastAsiaTheme="majorEastAsia" w:hAnsiTheme="majorHAnsi"/>
+      <w:rFonts w:ascii="Arial" w:hAnsi="Arial" w:eastAsia="DejaVu Sans" w:cs="DejaVu Sans" w:asciiTheme="majorHAnsi" w:cstheme="majorBidi" w:eastAsiaTheme="majorEastAsia" w:hAnsiTheme="majorHAnsi"/>
       <w:spacing w:val="-10"/>
       <w:kern w:val="2"/>
       <w:sz w:val="56"/>
@@ -1930,7 +2162,7 @@
     <w:rsid w:val="000c1256"/>
     <w:pPr/>
     <w:rPr>
-      <w:rFonts w:eastAsia="" w:cs="" w:cstheme="majorBidi" w:eastAsiaTheme="majorEastAsia"/>
+      <w:rFonts w:eastAsia="DejaVu Sans" w:cs="DejaVu Sans" w:cstheme="majorBidi" w:eastAsiaTheme="majorEastAsia"/>
       <w:color w:themeColor="text1" w:themeTint="a6" w:val="595959"/>
       <w:spacing w:val="15"/>
       <w:sz w:val="28"/>
@@ -2038,9 +2270,9 @@
 </file>
 
 <file path=word/theme/theme1.xml><?xml version="1.0" encoding="utf-8"?>
-<a:theme xmlns:a="http://schemas.openxmlformats.org/drawingml/2006/main" xmlns:r="http://schemas.openxmlformats.org/officeDocument/2006/relationships" name="Motyw pakietu Office">
+<a:theme xmlns:a="http://schemas.openxmlformats.org/drawingml/2006/main" xmlns:r="http://schemas.openxmlformats.org/officeDocument/2006/relationships" name="Office">
   <a:themeElements>
-    <a:clrScheme name="Pakiet Office">
+    <a:clrScheme name="LibreOffice">
       <a:dk1>
         <a:srgbClr val="000000"/>
       </a:dk1>
@@ -2048,46 +2280,46 @@
         <a:srgbClr val="ffffff"/>
       </a:lt1>
       <a:dk2>
-        <a:srgbClr val="0e2841"/>
+        <a:srgbClr val="000000"/>
       </a:dk2>
       <a:lt2>
-        <a:srgbClr val="e8e8e8"/>
+        <a:srgbClr val="ffffff"/>
       </a:lt2>
       <a:accent1>
-        <a:srgbClr val="156082"/>
+        <a:srgbClr val="18a303"/>
       </a:accent1>
       <a:accent2>
-        <a:srgbClr val="e97132"/>
+        <a:srgbClr val="0369a3"/>
       </a:accent2>
       <a:accent3>
-        <a:srgbClr val="196b24"/>
+        <a:srgbClr val="a33e03"/>
       </a:accent3>
       <a:accent4>
-        <a:srgbClr val="0f9ed5"/>
+        <a:srgbClr val="8e03a3"/>
       </a:accent4>
       <a:accent5>
-        <a:srgbClr val="a02b93"/>
+        <a:srgbClr val="c99c00"/>
       </a:accent5>
       <a:accent6>
-        <a:srgbClr val="4ea72e"/>
+        <a:srgbClr val="c9211e"/>
       </a:accent6>
       <a:hlink>
-        <a:srgbClr val="467886"/>
+        <a:srgbClr val="0000ee"/>
       </a:hlink>
       <a:folHlink>
-        <a:srgbClr val="96607d"/>
+        <a:srgbClr val="551a8b"/>
       </a:folHlink>
     </a:clrScheme>
-    <a:fontScheme name="Pakiet Office">
+    <a:fontScheme name="Office">
       <a:majorFont>
-        <a:latin typeface="Aptos Display" panose="02110004020202020204" pitchFamily="0" charset="1"/>
-        <a:ea typeface=""/>
-        <a:cs typeface=""/>
+        <a:latin typeface="Arial" pitchFamily="0" charset="1"/>
+        <a:ea typeface="DejaVu Sans" pitchFamily="0" charset="1"/>
+        <a:cs typeface="DejaVu Sans" pitchFamily="0" charset="1"/>
       </a:majorFont>
       <a:minorFont>
-        <a:latin typeface="Aptos" panose="02110004020202020204" pitchFamily="0" charset="1"/>
-        <a:ea typeface=""/>
-        <a:cs typeface=""/>
+        <a:latin typeface="Arial" pitchFamily="0" charset="1"/>
+        <a:ea typeface="DejaVu Sans" pitchFamily="0" charset="1"/>
+        <a:cs typeface="DejaVu Sans" pitchFamily="0" charset="1"/>
       </a:minorFont>
     </a:fontScheme>
     <a:fmtScheme>
@@ -2095,67 +2327,25 @@
         <a:solidFill>
           <a:schemeClr val="phClr"/>
         </a:solidFill>
-        <a:gradFill>
-          <a:gsLst>
-            <a:gs pos="0">
-              <a:schemeClr val="phClr">
-                <a:lumMod val="110000"/>
-                <a:tint val="67000"/>
-              </a:schemeClr>
-            </a:gs>
-            <a:gs pos="50000">
-              <a:schemeClr val="phClr">
-                <a:lumMod val="105000"/>
-                <a:tint val="73000"/>
-              </a:schemeClr>
-            </a:gs>
-            <a:gs pos="100000">
-              <a:schemeClr val="phClr">
-                <a:lumMod val="105000"/>
-                <a:tint val="81000"/>
-              </a:schemeClr>
-            </a:gs>
-          </a:gsLst>
-          <a:lin ang="5400000" scaled="0"/>
-          <a:tileRect l="0" t="0" r="0" b="0"/>
-        </a:gradFill>
-        <a:gradFill>
-          <a:gsLst>
-            <a:gs pos="0">
-              <a:schemeClr val="phClr">
-                <a:lumMod val="102000"/>
-                <a:tint val="94000"/>
-              </a:schemeClr>
-            </a:gs>
-            <a:gs pos="50000">
-              <a:schemeClr val="phClr">
-                <a:lumMod val="100000"/>
-                <a:shade val="100000"/>
-              </a:schemeClr>
-            </a:gs>
-            <a:gs pos="100000">
-              <a:schemeClr val="phClr">
-                <a:lumMod val="99000"/>
-                <a:shade val="78000"/>
-              </a:schemeClr>
-            </a:gs>
-          </a:gsLst>
-          <a:lin ang="5400000" scaled="0"/>
-          <a:tileRect l="0" t="0" r="0" b="0"/>
-        </a:gradFill>
+        <a:solidFill>
+          <a:schemeClr val="phClr"/>
+        </a:solidFill>
+        <a:solidFill>
+          <a:schemeClr val="phClr"/>
+        </a:solidFill>
       </a:fillStyleLst>
       <a:lnStyleLst>
-        <a:ln w="12700" cap="flat" cmpd="sng" algn="ctr">
+        <a:ln w="6350" cap="flat" cmpd="sng" algn="ctr">
           <a:prstDash val="solid"/>
-          <a:miter lim="800000"/>
+          <a:miter/>
         </a:ln>
-        <a:ln w="19050" cap="flat" cmpd="sng" algn="ctr">
+        <a:ln w="6350" cap="flat" cmpd="sng" algn="ctr">
           <a:prstDash val="solid"/>
-          <a:miter lim="800000"/>
+          <a:miter/>
         </a:ln>
-        <a:ln w="25400" cap="flat" cmpd="sng" algn="ctr">
+        <a:ln w="6350" cap="flat" cmpd="sng" algn="ctr">
           <a:prstDash val="solid"/>
-          <a:miter lim="800000"/>
+          <a:miter/>
         </a:ln>
       </a:lnStyleLst>
       <a:effectStyleLst>
@@ -2174,35 +2364,11 @@
           <a:schemeClr val="phClr"/>
         </a:solidFill>
         <a:solidFill>
-          <a:schemeClr val="phClr">
-            <a:tint val="95000"/>
-          </a:schemeClr>
+          <a:schemeClr val="phClr"/>
         </a:solidFill>
-        <a:gradFill>
-          <a:gsLst>
-            <a:gs pos="0">
-              <a:schemeClr val="phClr">
-                <a:tint val="93000"/>
-                <a:shade val="98000"/>
-                <a:lumMod val="102000"/>
-              </a:schemeClr>
-            </a:gs>
-            <a:gs pos="50000">
-              <a:schemeClr val="phClr">
-                <a:tint val="98000"/>
-                <a:shade val="90000"/>
-                <a:lumMod val="103000"/>
-              </a:schemeClr>
-            </a:gs>
-            <a:gs pos="100000">
-              <a:schemeClr val="phClr">
-                <a:shade val="63000"/>
-              </a:schemeClr>
-            </a:gs>
-          </a:gsLst>
-          <a:lin ang="5400000" scaled="0"/>
-          <a:tileRect l="0" t="0" r="0" b="0"/>
-        </a:gradFill>
+        <a:solidFill>
+          <a:schemeClr val="phClr"/>
+        </a:solidFill>
       </a:bgFillStyleLst>
     </a:fmtScheme>
   </a:themeElements>

</xml_diff>